<commit_message>
03/20 Aid DataTableDesignTsp+VBE+Admin+FunXL 1
</commit_message>
<xml_diff>
--- a/EXCEL_CodeSource/Classeurs_CodeSource/SheetsList/Lister le nom des feuilles dans Excel.docx
+++ b/EXCEL_CodeSource/Classeurs_CodeSource/SheetsList/Lister le nom des feuilles dans Excel.docx
@@ -152,7 +152,7 @@
       <w:r>
         <w:fldChar w:fldCharType="separate"/>
       </w:r>
-      <w:hyperlink w:anchor="_Toc224836523" w:history="1">
+      <w:hyperlink w:anchor="_Toc224925008" w:history="1">
         <w:r>
           <w:rPr>
             <w:rStyle w:val="Lienhypertexte"/>
@@ -179,7 +179,7 @@
             <w:noProof/>
             <w:webHidden/>
           </w:rPr>
-          <w:instrText xml:space="preserve"> PAGEREF _Toc224836523 \h </w:instrText>
+          <w:instrText xml:space="preserve"> PAGEREF _Toc224925008 \h </w:instrText>
         </w:r>
         <w:r>
           <w:rPr>
@@ -226,7 +226,7 @@
           <w14:ligatures w14:val="standardContextual"/>
         </w:rPr>
       </w:pPr>
-      <w:hyperlink w:anchor="_Toc224836524" w:history="1">
+      <w:hyperlink w:anchor="_Toc224925009" w:history="1">
         <w:r>
           <w:rPr>
             <w:rStyle w:val="Lienhypertexte"/>
@@ -253,7 +253,7 @@
             <w:noProof/>
             <w:webHidden/>
           </w:rPr>
-          <w:instrText xml:space="preserve"> PAGEREF _Toc224836524 \h </w:instrText>
+          <w:instrText xml:space="preserve"> PAGEREF _Toc224925009 \h </w:instrText>
         </w:r>
         <w:r>
           <w:rPr>
@@ -300,7 +300,7 @@
           <w14:ligatures w14:val="standardContextual"/>
         </w:rPr>
       </w:pPr>
-      <w:hyperlink w:anchor="_Toc224836525" w:history="1">
+      <w:hyperlink w:anchor="_Toc224925010" w:history="1">
         <w:r>
           <w:rPr>
             <w:rStyle w:val="Lienhypertexte"/>
@@ -327,7 +327,7 @@
             <w:noProof/>
             <w:webHidden/>
           </w:rPr>
-          <w:instrText xml:space="preserve"> PAGEREF _Toc224836525 \h </w:instrText>
+          <w:instrText xml:space="preserve"> PAGEREF _Toc224925010 \h </w:instrText>
         </w:r>
         <w:r>
           <w:rPr>
@@ -374,7 +374,7 @@
           <w14:ligatures w14:val="standardContextual"/>
         </w:rPr>
       </w:pPr>
-      <w:hyperlink w:anchor="_Toc224836526" w:history="1">
+      <w:hyperlink w:anchor="_Toc224925011" w:history="1">
         <w:r>
           <w:rPr>
             <w:rStyle w:val="Lienhypertexte"/>
@@ -401,7 +401,7 @@
             <w:noProof/>
             <w:webHidden/>
           </w:rPr>
-          <w:instrText xml:space="preserve"> PAGEREF _Toc224836526 \h </w:instrText>
+          <w:instrText xml:space="preserve"> PAGEREF _Toc224925011 \h </w:instrText>
         </w:r>
         <w:r>
           <w:rPr>
@@ -450,7 +450,7 @@
           <w14:ligatures w14:val="standardContextual"/>
         </w:rPr>
       </w:pPr>
-      <w:hyperlink w:anchor="_Toc224836527" w:history="1">
+      <w:hyperlink w:anchor="_Toc224925012" w:history="1">
         <w:r>
           <w:rPr>
             <w:rStyle w:val="Lienhypertexte"/>
@@ -477,7 +477,7 @@
             <w:noProof/>
             <w:webHidden/>
           </w:rPr>
-          <w:instrText xml:space="preserve"> PAGEREF _Toc224836527 \h </w:instrText>
+          <w:instrText xml:space="preserve"> PAGEREF _Toc224925012 \h </w:instrText>
         </w:r>
         <w:r>
           <w:rPr>
@@ -524,7 +524,7 @@
           <w14:ligatures w14:val="standardContextual"/>
         </w:rPr>
       </w:pPr>
-      <w:hyperlink w:anchor="_Toc224836528" w:history="1">
+      <w:hyperlink w:anchor="_Toc224925013" w:history="1">
         <w:r>
           <w:rPr>
             <w:rStyle w:val="Lienhypertexte"/>
@@ -551,7 +551,7 @@
             <w:noProof/>
             <w:webHidden/>
           </w:rPr>
-          <w:instrText xml:space="preserve"> PAGEREF _Toc224836528 \h </w:instrText>
+          <w:instrText xml:space="preserve"> PAGEREF _Toc224925013 \h </w:instrText>
         </w:r>
         <w:r>
           <w:rPr>
@@ -599,7 +599,7 @@
           <w14:ligatures w14:val="standardContextual"/>
         </w:rPr>
       </w:pPr>
-      <w:hyperlink w:anchor="_Toc224836529" w:history="1">
+      <w:hyperlink w:anchor="_Toc224925014" w:history="1">
         <w:r>
           <w:rPr>
             <w:rStyle w:val="Lienhypertexte"/>
@@ -626,7 +626,7 @@
             <w:noProof/>
             <w:webHidden/>
           </w:rPr>
-          <w:instrText xml:space="preserve"> PAGEREF _Toc224836529 \h </w:instrText>
+          <w:instrText xml:space="preserve"> PAGEREF _Toc224925014 \h </w:instrText>
         </w:r>
         <w:r>
           <w:rPr>
@@ -674,7 +674,7 @@
           <w14:ligatures w14:val="standardContextual"/>
         </w:rPr>
       </w:pPr>
-      <w:hyperlink w:anchor="_Toc224836530" w:history="1">
+      <w:hyperlink w:anchor="_Toc224925015" w:history="1">
         <w:r>
           <w:rPr>
             <w:rStyle w:val="Lienhypertexte"/>
@@ -701,7 +701,7 @@
             <w:noProof/>
             <w:webHidden/>
           </w:rPr>
-          <w:instrText xml:space="preserve"> PAGEREF _Toc224836530 \h </w:instrText>
+          <w:instrText xml:space="preserve"> PAGEREF _Toc224925015 \h </w:instrText>
         </w:r>
         <w:r>
           <w:rPr>
@@ -749,7 +749,7 @@
           <w14:ligatures w14:val="standardContextual"/>
         </w:rPr>
       </w:pPr>
-      <w:hyperlink w:anchor="_Toc224836531" w:history="1">
+      <w:hyperlink w:anchor="_Toc224925016" w:history="1">
         <w:r>
           <w:rPr>
             <w:rStyle w:val="Lienhypertexte"/>
@@ -776,7 +776,7 @@
             <w:noProof/>
             <w:webHidden/>
           </w:rPr>
-          <w:instrText xml:space="preserve"> PAGEREF _Toc224836531 \h </w:instrText>
+          <w:instrText xml:space="preserve"> PAGEREF _Toc224925016 \h </w:instrText>
         </w:r>
         <w:r>
           <w:rPr>
@@ -824,7 +824,7 @@
           <w14:ligatures w14:val="standardContextual"/>
         </w:rPr>
       </w:pPr>
-      <w:hyperlink w:anchor="_Toc224836532" w:history="1">
+      <w:hyperlink w:anchor="_Toc224925017" w:history="1">
         <w:r>
           <w:rPr>
             <w:rStyle w:val="Lienhypertexte"/>
@@ -851,7 +851,7 @@
             <w:noProof/>
             <w:webHidden/>
           </w:rPr>
-          <w:instrText xml:space="preserve"> PAGEREF _Toc224836532 \h </w:instrText>
+          <w:instrText xml:space="preserve"> PAGEREF _Toc224925017 \h </w:instrText>
         </w:r>
         <w:r>
           <w:rPr>
@@ -898,7 +898,7 @@
           <w14:ligatures w14:val="standardContextual"/>
         </w:rPr>
       </w:pPr>
-      <w:hyperlink w:anchor="_Toc224836533" w:history="1">
+      <w:hyperlink w:anchor="_Toc224925018" w:history="1">
         <w:r>
           <w:rPr>
             <w:rStyle w:val="Lienhypertexte"/>
@@ -925,7 +925,7 @@
             <w:noProof/>
             <w:webHidden/>
           </w:rPr>
-          <w:instrText xml:space="preserve"> PAGEREF _Toc224836533 \h </w:instrText>
+          <w:instrText xml:space="preserve"> PAGEREF _Toc224925018 \h </w:instrText>
         </w:r>
         <w:r>
           <w:rPr>
@@ -972,7 +972,7 @@
           <w14:ligatures w14:val="standardContextual"/>
         </w:rPr>
       </w:pPr>
-      <w:hyperlink w:anchor="_Toc224836534" w:history="1">
+      <w:hyperlink w:anchor="_Toc224925019" w:history="1">
         <w:r>
           <w:rPr>
             <w:rStyle w:val="Lienhypertexte"/>
@@ -999,7 +999,7 @@
             <w:noProof/>
             <w:webHidden/>
           </w:rPr>
-          <w:instrText xml:space="preserve"> PAGEREF _Toc224836534 \h </w:instrText>
+          <w:instrText xml:space="preserve"> PAGEREF _Toc224925019 \h </w:instrText>
         </w:r>
         <w:r>
           <w:rPr>
@@ -1046,7 +1046,7 @@
           <w14:ligatures w14:val="standardContextual"/>
         </w:rPr>
       </w:pPr>
-      <w:hyperlink w:anchor="_Toc224836535" w:history="1">
+      <w:hyperlink w:anchor="_Toc224925020" w:history="1">
         <w:r>
           <w:rPr>
             <w:rStyle w:val="Lienhypertexte"/>
@@ -1073,7 +1073,7 @@
             <w:noProof/>
             <w:webHidden/>
           </w:rPr>
-          <w:instrText xml:space="preserve"> PAGEREF _Toc224836535 \h </w:instrText>
+          <w:instrText xml:space="preserve"> PAGEREF _Toc224925020 \h </w:instrText>
         </w:r>
         <w:r>
           <w:rPr>
@@ -1121,7 +1121,7 @@
           <w14:ligatures w14:val="standardContextual"/>
         </w:rPr>
       </w:pPr>
-      <w:hyperlink w:anchor="_Toc224836536" w:history="1">
+      <w:hyperlink w:anchor="_Toc224925021" w:history="1">
         <w:r>
           <w:rPr>
             <w:rStyle w:val="Lienhypertexte"/>
@@ -1148,7 +1148,7 @@
             <w:noProof/>
             <w:webHidden/>
           </w:rPr>
-          <w:instrText xml:space="preserve"> PAGEREF _Toc224836536 \h </w:instrText>
+          <w:instrText xml:space="preserve"> PAGEREF _Toc224925021 \h </w:instrText>
         </w:r>
         <w:r>
           <w:rPr>
@@ -1196,7 +1196,7 @@
           <w14:ligatures w14:val="standardContextual"/>
         </w:rPr>
       </w:pPr>
-      <w:hyperlink w:anchor="_Toc224836537" w:history="1">
+      <w:hyperlink w:anchor="_Toc224925022" w:history="1">
         <w:r>
           <w:rPr>
             <w:rStyle w:val="Lienhypertexte"/>
@@ -1223,7 +1223,7 @@
             <w:noProof/>
             <w:webHidden/>
           </w:rPr>
-          <w:instrText xml:space="preserve"> PAGEREF _Toc224836537 \h </w:instrText>
+          <w:instrText xml:space="preserve"> PAGEREF _Toc224925022 \h </w:instrText>
         </w:r>
         <w:r>
           <w:rPr>
@@ -1271,7 +1271,7 @@
           <w14:ligatures w14:val="standardContextual"/>
         </w:rPr>
       </w:pPr>
-      <w:hyperlink w:anchor="_Toc224836538" w:history="1">
+      <w:hyperlink w:anchor="_Toc224925023" w:history="1">
         <w:r>
           <w:rPr>
             <w:rStyle w:val="Lienhypertexte"/>
@@ -1298,7 +1298,7 @@
             <w:noProof/>
             <w:webHidden/>
           </w:rPr>
-          <w:instrText xml:space="preserve"> PAGEREF _Toc224836538 \h </w:instrText>
+          <w:instrText xml:space="preserve"> PAGEREF _Toc224925023 \h </w:instrText>
         </w:r>
         <w:r>
           <w:rPr>
@@ -1345,7 +1345,7 @@
           <w14:ligatures w14:val="standardContextual"/>
         </w:rPr>
       </w:pPr>
-      <w:hyperlink w:anchor="_Toc224836539" w:history="1">
+      <w:hyperlink w:anchor="_Toc224925024" w:history="1">
         <w:r>
           <w:rPr>
             <w:rStyle w:val="Lienhypertexte"/>
@@ -1372,7 +1372,7 @@
             <w:noProof/>
             <w:webHidden/>
           </w:rPr>
-          <w:instrText xml:space="preserve"> PAGEREF _Toc224836539 \h </w:instrText>
+          <w:instrText xml:space="preserve"> PAGEREF _Toc224925024 \h </w:instrText>
         </w:r>
         <w:r>
           <w:rPr>
@@ -1420,7 +1420,7 @@
           <w14:ligatures w14:val="standardContextual"/>
         </w:rPr>
       </w:pPr>
-      <w:hyperlink w:anchor="_Toc224836540" w:history="1">
+      <w:hyperlink w:anchor="_Toc224925025" w:history="1">
         <w:r>
           <w:rPr>
             <w:rStyle w:val="Lienhypertexte"/>
@@ -1447,7 +1447,7 @@
             <w:noProof/>
             <w:webHidden/>
           </w:rPr>
-          <w:instrText xml:space="preserve"> PAGEREF _Toc224836540 \h </w:instrText>
+          <w:instrText xml:space="preserve"> PAGEREF _Toc224925025 \h </w:instrText>
         </w:r>
         <w:r>
           <w:rPr>
@@ -1495,7 +1495,7 @@
           <w14:ligatures w14:val="standardContextual"/>
         </w:rPr>
       </w:pPr>
-      <w:hyperlink w:anchor="_Toc224836541" w:history="1">
+      <w:hyperlink w:anchor="_Toc224925026" w:history="1">
         <w:r>
           <w:rPr>
             <w:rStyle w:val="Lienhypertexte"/>
@@ -1522,7 +1522,7 @@
             <w:noProof/>
             <w:webHidden/>
           </w:rPr>
-          <w:instrText xml:space="preserve"> PAGEREF _Toc224836541 \h </w:instrText>
+          <w:instrText xml:space="preserve"> PAGEREF _Toc224925026 \h </w:instrText>
         </w:r>
         <w:r>
           <w:rPr>
@@ -1570,7 +1570,7 @@
           <w14:ligatures w14:val="standardContextual"/>
         </w:rPr>
       </w:pPr>
-      <w:hyperlink w:anchor="_Toc224836542" w:history="1">
+      <w:hyperlink w:anchor="_Toc224925027" w:history="1">
         <w:r>
           <w:rPr>
             <w:rStyle w:val="Lienhypertexte"/>
@@ -1597,7 +1597,7 @@
             <w:noProof/>
             <w:webHidden/>
           </w:rPr>
-          <w:instrText xml:space="preserve"> PAGEREF _Toc224836542 \h </w:instrText>
+          <w:instrText xml:space="preserve"> PAGEREF _Toc224925027 \h </w:instrText>
         </w:r>
         <w:r>
           <w:rPr>
@@ -1644,7 +1644,7 @@
           <w14:ligatures w14:val="standardContextual"/>
         </w:rPr>
       </w:pPr>
-      <w:hyperlink w:anchor="_Toc224836543" w:history="1">
+      <w:hyperlink w:anchor="_Toc224925028" w:history="1">
         <w:r>
           <w:rPr>
             <w:rStyle w:val="Lienhypertexte"/>
@@ -1671,7 +1671,7 @@
             <w:noProof/>
             <w:webHidden/>
           </w:rPr>
-          <w:instrText xml:space="preserve"> PAGEREF _Toc224836543 \h </w:instrText>
+          <w:instrText xml:space="preserve"> PAGEREF _Toc224925028 \h </w:instrText>
         </w:r>
         <w:r>
           <w:rPr>
@@ -1719,7 +1719,7 @@
           <w14:ligatures w14:val="standardContextual"/>
         </w:rPr>
       </w:pPr>
-      <w:hyperlink w:anchor="_Toc224836544" w:history="1">
+      <w:hyperlink w:anchor="_Toc224925029" w:history="1">
         <w:r>
           <w:rPr>
             <w:rStyle w:val="Lienhypertexte"/>
@@ -1746,7 +1746,7 @@
             <w:noProof/>
             <w:webHidden/>
           </w:rPr>
-          <w:instrText xml:space="preserve"> PAGEREF _Toc224836544 \h </w:instrText>
+          <w:instrText xml:space="preserve"> PAGEREF _Toc224925029 \h </w:instrText>
         </w:r>
         <w:r>
           <w:rPr>
@@ -1794,7 +1794,7 @@
           <w14:ligatures w14:val="standardContextual"/>
         </w:rPr>
       </w:pPr>
-      <w:hyperlink w:anchor="_Toc224836545" w:history="1">
+      <w:hyperlink w:anchor="_Toc224925030" w:history="1">
         <w:r>
           <w:rPr>
             <w:rStyle w:val="Lienhypertexte"/>
@@ -1821,7 +1821,7 @@
             <w:noProof/>
             <w:webHidden/>
           </w:rPr>
-          <w:instrText xml:space="preserve"> PAGEREF _Toc224836545 \h </w:instrText>
+          <w:instrText xml:space="preserve"> PAGEREF _Toc224925030 \h </w:instrText>
         </w:r>
         <w:r>
           <w:rPr>
@@ -1869,7 +1869,7 @@
           <w14:ligatures w14:val="standardContextual"/>
         </w:rPr>
       </w:pPr>
-      <w:hyperlink w:anchor="_Toc224836546" w:history="1">
+      <w:hyperlink w:anchor="_Toc224925031" w:history="1">
         <w:r>
           <w:rPr>
             <w:rStyle w:val="Lienhypertexte"/>
@@ -1896,7 +1896,7 @@
             <w:noProof/>
             <w:webHidden/>
           </w:rPr>
-          <w:instrText xml:space="preserve"> PAGEREF _Toc224836546 \h </w:instrText>
+          <w:instrText xml:space="preserve"> PAGEREF _Toc224925031 \h </w:instrText>
         </w:r>
         <w:r>
           <w:rPr>
@@ -1944,7 +1944,7 @@
           <w14:ligatures w14:val="standardContextual"/>
         </w:rPr>
       </w:pPr>
-      <w:hyperlink w:anchor="_Toc224836547" w:history="1">
+      <w:hyperlink w:anchor="_Toc224925032" w:history="1">
         <w:r>
           <w:rPr>
             <w:rStyle w:val="Lienhypertexte"/>
@@ -1971,7 +1971,7 @@
             <w:noProof/>
             <w:webHidden/>
           </w:rPr>
-          <w:instrText xml:space="preserve"> PAGEREF _Toc224836547 \h </w:instrText>
+          <w:instrText xml:space="preserve"> PAGEREF _Toc224925032 \h </w:instrText>
         </w:r>
         <w:r>
           <w:rPr>
@@ -2018,7 +2018,7 @@
           <w14:ligatures w14:val="standardContextual"/>
         </w:rPr>
       </w:pPr>
-      <w:hyperlink w:anchor="_Toc224836548" w:history="1">
+      <w:hyperlink w:anchor="_Toc224925033" w:history="1">
         <w:r>
           <w:rPr>
             <w:rStyle w:val="Lienhypertexte"/>
@@ -2045,7 +2045,7 @@
             <w:noProof/>
             <w:webHidden/>
           </w:rPr>
-          <w:instrText xml:space="preserve"> PAGEREF _Toc224836548 \h </w:instrText>
+          <w:instrText xml:space="preserve"> PAGEREF _Toc224925033 \h </w:instrText>
         </w:r>
         <w:r>
           <w:rPr>
@@ -2092,7 +2092,7 @@
           <w14:ligatures w14:val="standardContextual"/>
         </w:rPr>
       </w:pPr>
-      <w:hyperlink w:anchor="_Toc224836549" w:history="1">
+      <w:hyperlink w:anchor="_Toc224925034" w:history="1">
         <w:r>
           <w:rPr>
             <w:rStyle w:val="Lienhypertexte"/>
@@ -2119,7 +2119,7 @@
             <w:noProof/>
             <w:webHidden/>
           </w:rPr>
-          <w:instrText xml:space="preserve"> PAGEREF _Toc224836549 \h </w:instrText>
+          <w:instrText xml:space="preserve"> PAGEREF _Toc224925034 \h </w:instrText>
         </w:r>
         <w:r>
           <w:rPr>
@@ -2166,7 +2166,7 @@
           <w14:ligatures w14:val="standardContextual"/>
         </w:rPr>
       </w:pPr>
-      <w:hyperlink w:anchor="_Toc224836550" w:history="1">
+      <w:hyperlink w:anchor="_Toc224925035" w:history="1">
         <w:r>
           <w:rPr>
             <w:rStyle w:val="Lienhypertexte"/>
@@ -2193,7 +2193,7 @@
             <w:noProof/>
             <w:webHidden/>
           </w:rPr>
-          <w:instrText xml:space="preserve"> PAGEREF _Toc224836550 \h </w:instrText>
+          <w:instrText xml:space="preserve"> PAGEREF _Toc224925035 \h </w:instrText>
         </w:r>
         <w:r>
           <w:rPr>
@@ -2240,7 +2240,7 @@
           <w14:ligatures w14:val="standardContextual"/>
         </w:rPr>
       </w:pPr>
-      <w:hyperlink w:anchor="_Toc224836551" w:history="1">
+      <w:hyperlink w:anchor="_Toc224925036" w:history="1">
         <w:r>
           <w:rPr>
             <w:rStyle w:val="Lienhypertexte"/>
@@ -2267,7 +2267,7 @@
             <w:noProof/>
             <w:webHidden/>
           </w:rPr>
-          <w:instrText xml:space="preserve"> PAGEREF _Toc224836551 \h </w:instrText>
+          <w:instrText xml:space="preserve"> PAGEREF _Toc224925036 \h </w:instrText>
         </w:r>
         <w:r>
           <w:rPr>
@@ -2315,7 +2315,7 @@
           <w14:ligatures w14:val="standardContextual"/>
         </w:rPr>
       </w:pPr>
-      <w:hyperlink w:anchor="_Toc224836552" w:history="1">
+      <w:hyperlink w:anchor="_Toc224925037" w:history="1">
         <w:r>
           <w:rPr>
             <w:rStyle w:val="Lienhypertexte"/>
@@ -2342,7 +2342,7 @@
             <w:noProof/>
             <w:webHidden/>
           </w:rPr>
-          <w:instrText xml:space="preserve"> PAGEREF _Toc224836552 \h </w:instrText>
+          <w:instrText xml:space="preserve"> PAGEREF _Toc224925037 \h </w:instrText>
         </w:r>
         <w:r>
           <w:rPr>
@@ -2390,7 +2390,7 @@
           <w14:ligatures w14:val="standardContextual"/>
         </w:rPr>
       </w:pPr>
-      <w:hyperlink w:anchor="_Toc224836553" w:history="1">
+      <w:hyperlink w:anchor="_Toc224925038" w:history="1">
         <w:r>
           <w:rPr>
             <w:rStyle w:val="Lienhypertexte"/>
@@ -2417,7 +2417,7 @@
             <w:noProof/>
             <w:webHidden/>
           </w:rPr>
-          <w:instrText xml:space="preserve"> PAGEREF _Toc224836553 \h </w:instrText>
+          <w:instrText xml:space="preserve"> PAGEREF _Toc224925038 \h </w:instrText>
         </w:r>
         <w:r>
           <w:rPr>
@@ -2464,7 +2464,7 @@
           <w14:ligatures w14:val="standardContextual"/>
         </w:rPr>
       </w:pPr>
-      <w:hyperlink w:anchor="_Toc224836554" w:history="1">
+      <w:hyperlink w:anchor="_Toc224925039" w:history="1">
         <w:r>
           <w:rPr>
             <w:rStyle w:val="Lienhypertexte"/>
@@ -2491,7 +2491,7 @@
             <w:noProof/>
             <w:webHidden/>
           </w:rPr>
-          <w:instrText xml:space="preserve"> PAGEREF _Toc224836554 \h </w:instrText>
+          <w:instrText xml:space="preserve"> PAGEREF _Toc224925039 \h </w:instrText>
         </w:r>
         <w:r>
           <w:rPr>
@@ -2538,7 +2538,7 @@
           <w14:ligatures w14:val="standardContextual"/>
         </w:rPr>
       </w:pPr>
-      <w:hyperlink w:anchor="_Toc224836555" w:history="1">
+      <w:hyperlink w:anchor="_Toc224925040" w:history="1">
         <w:r>
           <w:rPr>
             <w:rStyle w:val="Lienhypertexte"/>
@@ -2565,7 +2565,7 @@
             <w:noProof/>
             <w:webHidden/>
           </w:rPr>
-          <w:instrText xml:space="preserve"> PAGEREF _Toc224836555 \h </w:instrText>
+          <w:instrText xml:space="preserve"> PAGEREF _Toc224925040 \h </w:instrText>
         </w:r>
         <w:r>
           <w:rPr>
@@ -2612,7 +2612,7 @@
           <w14:ligatures w14:val="standardContextual"/>
         </w:rPr>
       </w:pPr>
-      <w:hyperlink w:anchor="_Toc224836556" w:history="1">
+      <w:hyperlink w:anchor="_Toc224925041" w:history="1">
         <w:r>
           <w:rPr>
             <w:rStyle w:val="Lienhypertexte"/>
@@ -2639,7 +2639,7 @@
             <w:noProof/>
             <w:webHidden/>
           </w:rPr>
-          <w:instrText xml:space="preserve"> PAGEREF _Toc224836556 \h </w:instrText>
+          <w:instrText xml:space="preserve"> PAGEREF _Toc224925041 \h </w:instrText>
         </w:r>
         <w:r>
           <w:rPr>
@@ -2687,7 +2687,7 @@
           <w14:ligatures w14:val="standardContextual"/>
         </w:rPr>
       </w:pPr>
-      <w:hyperlink w:anchor="_Toc224836557" w:history="1">
+      <w:hyperlink w:anchor="_Toc224925042" w:history="1">
         <w:r>
           <w:rPr>
             <w:rStyle w:val="Lienhypertexte"/>
@@ -2714,7 +2714,7 @@
             <w:noProof/>
             <w:webHidden/>
           </w:rPr>
-          <w:instrText xml:space="preserve"> PAGEREF _Toc224836557 \h </w:instrText>
+          <w:instrText xml:space="preserve"> PAGEREF _Toc224925042 \h </w:instrText>
         </w:r>
         <w:r>
           <w:rPr>
@@ -2761,7 +2761,7 @@
           <w14:ligatures w14:val="standardContextual"/>
         </w:rPr>
       </w:pPr>
-      <w:hyperlink w:anchor="_Toc224836558" w:history="1">
+      <w:hyperlink w:anchor="_Toc224925043" w:history="1">
         <w:r>
           <w:rPr>
             <w:rStyle w:val="Lienhypertexte"/>
@@ -2788,7 +2788,7 @@
             <w:noProof/>
             <w:webHidden/>
           </w:rPr>
-          <w:instrText xml:space="preserve"> PAGEREF _Toc224836558 \h </w:instrText>
+          <w:instrText xml:space="preserve"> PAGEREF _Toc224925043 \h </w:instrText>
         </w:r>
         <w:r>
           <w:rPr>
@@ -2835,7 +2835,7 @@
           <w14:ligatures w14:val="standardContextual"/>
         </w:rPr>
       </w:pPr>
-      <w:hyperlink w:anchor="_Toc224836559" w:history="1">
+      <w:hyperlink w:anchor="_Toc224925044" w:history="1">
         <w:r>
           <w:rPr>
             <w:rStyle w:val="Lienhypertexte"/>
@@ -2862,7 +2862,7 @@
             <w:noProof/>
             <w:webHidden/>
           </w:rPr>
-          <w:instrText xml:space="preserve"> PAGEREF _Toc224836559 \h </w:instrText>
+          <w:instrText xml:space="preserve"> PAGEREF _Toc224925044 \h </w:instrText>
         </w:r>
         <w:r>
           <w:rPr>
@@ -2909,7 +2909,7 @@
           <w14:ligatures w14:val="standardContextual"/>
         </w:rPr>
       </w:pPr>
-      <w:hyperlink w:anchor="_Toc224836560" w:history="1">
+      <w:hyperlink w:anchor="_Toc224925045" w:history="1">
         <w:r>
           <w:rPr>
             <w:rStyle w:val="Lienhypertexte"/>
@@ -2936,7 +2936,7 @@
             <w:noProof/>
             <w:webHidden/>
           </w:rPr>
-          <w:instrText xml:space="preserve"> PAGEREF _Toc224836560 \h </w:instrText>
+          <w:instrText xml:space="preserve"> PAGEREF _Toc224925045 \h </w:instrText>
         </w:r>
         <w:r>
           <w:rPr>
@@ -2983,7 +2983,7 @@
           <w14:ligatures w14:val="standardContextual"/>
         </w:rPr>
       </w:pPr>
-      <w:hyperlink w:anchor="_Toc224836561" w:history="1">
+      <w:hyperlink w:anchor="_Toc224925046" w:history="1">
         <w:r>
           <w:rPr>
             <w:rStyle w:val="Lienhypertexte"/>
@@ -3010,7 +3010,7 @@
             <w:noProof/>
             <w:webHidden/>
           </w:rPr>
-          <w:instrText xml:space="preserve"> PAGEREF _Toc224836561 \h </w:instrText>
+          <w:instrText xml:space="preserve"> PAGEREF _Toc224925046 \h </w:instrText>
         </w:r>
         <w:r>
           <w:rPr>
@@ -3057,7 +3057,7 @@
           <w14:ligatures w14:val="standardContextual"/>
         </w:rPr>
       </w:pPr>
-      <w:hyperlink w:anchor="_Toc224836562" w:history="1">
+      <w:hyperlink w:anchor="_Toc224925047" w:history="1">
         <w:r>
           <w:rPr>
             <w:rStyle w:val="Lienhypertexte"/>
@@ -3084,7 +3084,7 @@
             <w:noProof/>
             <w:webHidden/>
           </w:rPr>
-          <w:instrText xml:space="preserve"> PAGEREF _Toc224836562 \h </w:instrText>
+          <w:instrText xml:space="preserve"> PAGEREF _Toc224925047 \h </w:instrText>
         </w:r>
         <w:r>
           <w:rPr>
@@ -3131,7 +3131,7 @@
           <w14:ligatures w14:val="standardContextual"/>
         </w:rPr>
       </w:pPr>
-      <w:hyperlink w:anchor="_Toc224836563" w:history="1">
+      <w:hyperlink w:anchor="_Toc224925048" w:history="1">
         <w:r>
           <w:rPr>
             <w:rStyle w:val="Lienhypertexte"/>
@@ -3158,7 +3158,7 @@
             <w:noProof/>
             <w:webHidden/>
           </w:rPr>
-          <w:instrText xml:space="preserve"> PAGEREF _Toc224836563 \h </w:instrText>
+          <w:instrText xml:space="preserve"> PAGEREF _Toc224925048 \h </w:instrText>
         </w:r>
         <w:r>
           <w:rPr>
@@ -3206,7 +3206,7 @@
           <w14:ligatures w14:val="standardContextual"/>
         </w:rPr>
       </w:pPr>
-      <w:hyperlink w:anchor="_Toc224836564" w:history="1">
+      <w:hyperlink w:anchor="_Toc224925049" w:history="1">
         <w:r>
           <w:rPr>
             <w:rStyle w:val="Lienhypertexte"/>
@@ -3233,7 +3233,7 @@
             <w:noProof/>
             <w:webHidden/>
           </w:rPr>
-          <w:instrText xml:space="preserve"> PAGEREF _Toc224836564 \h </w:instrText>
+          <w:instrText xml:space="preserve"> PAGEREF _Toc224925049 \h </w:instrText>
         </w:r>
         <w:r>
           <w:rPr>
@@ -3280,7 +3280,7 @@
           <w14:ligatures w14:val="standardContextual"/>
         </w:rPr>
       </w:pPr>
-      <w:hyperlink w:anchor="_Toc224836565" w:history="1">
+      <w:hyperlink w:anchor="_Toc224925050" w:history="1">
         <w:r>
           <w:rPr>
             <w:rStyle w:val="Lienhypertexte"/>
@@ -3307,7 +3307,7 @@
             <w:noProof/>
             <w:webHidden/>
           </w:rPr>
-          <w:instrText xml:space="preserve"> PAGEREF _Toc224836565 \h </w:instrText>
+          <w:instrText xml:space="preserve"> PAGEREF _Toc224925050 \h </w:instrText>
         </w:r>
         <w:r>
           <w:rPr>
@@ -3354,7 +3354,7 @@
           <w14:ligatures w14:val="standardContextual"/>
         </w:rPr>
       </w:pPr>
-      <w:hyperlink w:anchor="_Toc224836566" w:history="1">
+      <w:hyperlink w:anchor="_Toc224925051" w:history="1">
         <w:r>
           <w:rPr>
             <w:rStyle w:val="Lienhypertexte"/>
@@ -3381,7 +3381,7 @@
             <w:noProof/>
             <w:webHidden/>
           </w:rPr>
-          <w:instrText xml:space="preserve"> PAGEREF _Toc224836566 \h </w:instrText>
+          <w:instrText xml:space="preserve"> PAGEREF _Toc224925051 \h </w:instrText>
         </w:r>
         <w:r>
           <w:rPr>
@@ -3428,7 +3428,7 @@
           <w14:ligatures w14:val="standardContextual"/>
         </w:rPr>
       </w:pPr>
-      <w:hyperlink w:anchor="_Toc224836567" w:history="1">
+      <w:hyperlink w:anchor="_Toc224925052" w:history="1">
         <w:r>
           <w:rPr>
             <w:rStyle w:val="Lienhypertexte"/>
@@ -3455,7 +3455,7 @@
             <w:noProof/>
             <w:webHidden/>
           </w:rPr>
-          <w:instrText xml:space="preserve"> PAGEREF _Toc224836567 \h </w:instrText>
+          <w:instrText xml:space="preserve"> PAGEREF _Toc224925052 \h </w:instrText>
         </w:r>
         <w:r>
           <w:rPr>
@@ -3502,7 +3502,7 @@
           <w14:ligatures w14:val="standardContextual"/>
         </w:rPr>
       </w:pPr>
-      <w:hyperlink w:anchor="_Toc224836568" w:history="1">
+      <w:hyperlink w:anchor="_Toc224925053" w:history="1">
         <w:r>
           <w:rPr>
             <w:rStyle w:val="Lienhypertexte"/>
@@ -3529,7 +3529,7 @@
             <w:noProof/>
             <w:webHidden/>
           </w:rPr>
-          <w:instrText xml:space="preserve"> PAGEREF _Toc224836568 \h </w:instrText>
+          <w:instrText xml:space="preserve"> PAGEREF _Toc224925053 \h </w:instrText>
         </w:r>
         <w:r>
           <w:rPr>
@@ -3576,7 +3576,7 @@
           <w14:ligatures w14:val="standardContextual"/>
         </w:rPr>
       </w:pPr>
-      <w:hyperlink w:anchor="_Toc224836569" w:history="1">
+      <w:hyperlink w:anchor="_Toc224925054" w:history="1">
         <w:r>
           <w:rPr>
             <w:rStyle w:val="Lienhypertexte"/>
@@ -3603,7 +3603,7 @@
             <w:noProof/>
             <w:webHidden/>
           </w:rPr>
-          <w:instrText xml:space="preserve"> PAGEREF _Toc224836569 \h </w:instrText>
+          <w:instrText xml:space="preserve"> PAGEREF _Toc224925054 \h </w:instrText>
         </w:r>
         <w:r>
           <w:rPr>
@@ -3650,7 +3650,7 @@
           <w14:ligatures w14:val="standardContextual"/>
         </w:rPr>
       </w:pPr>
-      <w:hyperlink w:anchor="_Toc224836570" w:history="1">
+      <w:hyperlink w:anchor="_Toc224925055" w:history="1">
         <w:r>
           <w:rPr>
             <w:rStyle w:val="Lienhypertexte"/>
@@ -3677,7 +3677,7 @@
             <w:noProof/>
             <w:webHidden/>
           </w:rPr>
-          <w:instrText xml:space="preserve"> PAGEREF _Toc224836570 \h </w:instrText>
+          <w:instrText xml:space="preserve"> PAGEREF _Toc224925055 \h </w:instrText>
         </w:r>
         <w:r>
           <w:rPr>
@@ -3724,7 +3724,7 @@
           <w14:ligatures w14:val="standardContextual"/>
         </w:rPr>
       </w:pPr>
-      <w:hyperlink w:anchor="_Toc224836571" w:history="1">
+      <w:hyperlink w:anchor="_Toc224925056" w:history="1">
         <w:r>
           <w:rPr>
             <w:rStyle w:val="Lienhypertexte"/>
@@ -3751,7 +3751,7 @@
             <w:noProof/>
             <w:webHidden/>
           </w:rPr>
-          <w:instrText xml:space="preserve"> PAGEREF _Toc224836571 \h </w:instrText>
+          <w:instrText xml:space="preserve"> PAGEREF _Toc224925056 \h </w:instrText>
         </w:r>
         <w:r>
           <w:rPr>
@@ -3800,7 +3800,7 @@
           <w14:ligatures w14:val="standardContextual"/>
         </w:rPr>
       </w:pPr>
-      <w:hyperlink w:anchor="_Toc224836572" w:history="1">
+      <w:hyperlink w:anchor="_Toc224925057" w:history="1">
         <w:r>
           <w:rPr>
             <w:rStyle w:val="Lienhypertexte"/>
@@ -3828,7 +3828,7 @@
             <w:noProof/>
             <w:webHidden/>
           </w:rPr>
-          <w:instrText xml:space="preserve"> PAGEREF _Toc224836572 \h </w:instrText>
+          <w:instrText xml:space="preserve"> PAGEREF _Toc224925057 \h </w:instrText>
         </w:r>
         <w:r>
           <w:rPr>
@@ -3877,7 +3877,7 @@
           <w14:ligatures w14:val="standardContextual"/>
         </w:rPr>
       </w:pPr>
-      <w:hyperlink w:anchor="_Toc224836573" w:history="1">
+      <w:hyperlink w:anchor="_Toc224925058" w:history="1">
         <w:r>
           <w:rPr>
             <w:rStyle w:val="Lienhypertexte"/>
@@ -3904,7 +3904,7 @@
             <w:noProof/>
             <w:webHidden/>
           </w:rPr>
-          <w:instrText xml:space="preserve"> PAGEREF _Toc224836573 \h </w:instrText>
+          <w:instrText xml:space="preserve"> PAGEREF _Toc224925058 \h </w:instrText>
         </w:r>
         <w:r>
           <w:rPr>
@@ -3944,7 +3944,7 @@
       <w:pPr>
         <w:pStyle w:val="Titre1"/>
       </w:pPr>
-      <w:bookmarkStart w:id="0" w:name="_Toc224836523"/>
+      <w:bookmarkStart w:id="0" w:name="_Toc224925008"/>
       <w:r>
         <w:t>Prolégomènes</w:t>
       </w:r>
@@ -3954,7 +3954,7 @@
       <w:pPr>
         <w:pStyle w:val="Titre2"/>
       </w:pPr>
-      <w:bookmarkStart w:id="1" w:name="_Toc224836524"/>
+      <w:bookmarkStart w:id="1" w:name="_Toc224925009"/>
       <w:r>
         <w:t>Travailler avec un classeur Excel prenant en charge les macros</w:t>
       </w:r>
@@ -4140,7 +4140,7 @@
       <w:pPr>
         <w:pStyle w:val="Titre2"/>
       </w:pPr>
-      <w:bookmarkStart w:id="2" w:name="_Toc224836525"/>
+      <w:bookmarkStart w:id="2" w:name="_Toc224925010"/>
       <w:r>
         <w:lastRenderedPageBreak/>
         <w:t xml:space="preserve">Le </w:t>
@@ -4288,7 +4288,7 @@
       <w:pPr>
         <w:pStyle w:val="Titre2"/>
       </w:pPr>
-      <w:bookmarkStart w:id="3" w:name="_Toc224836526"/>
+      <w:bookmarkStart w:id="3" w:name="_Toc224925011"/>
       <w:r>
         <w:t xml:space="preserve">Code pour les </w:t>
       </w:r>
@@ -4384,7 +4384,7 @@
       <w:pPr>
         <w:pStyle w:val="Titre1"/>
       </w:pPr>
-      <w:bookmarkStart w:id="4" w:name="_Toc224836527"/>
+      <w:bookmarkStart w:id="4" w:name="_Toc224925012"/>
       <w:r>
         <w:t>Liste avec</w:t>
       </w:r>
@@ -4418,7 +4418,7 @@
       <w:pPr>
         <w:pStyle w:val="Titre2"/>
       </w:pPr>
-      <w:bookmarkStart w:id="5" w:name="_Toc224836528"/>
+      <w:bookmarkStart w:id="5" w:name="_Toc224925013"/>
       <w:r>
         <w:t xml:space="preserve">Avec </w:t>
       </w:r>
@@ -4974,7 +4974,7 @@
       <w:pPr>
         <w:pStyle w:val="Titre3"/>
       </w:pPr>
-      <w:bookmarkStart w:id="6" w:name="_Toc224836529"/>
+      <w:bookmarkStart w:id="6" w:name="_Toc224925014"/>
       <w:r>
         <w:t>Syntaxe de la fonction REMPLACER</w:t>
       </w:r>
@@ -5359,7 +5359,7 @@
       <w:pPr>
         <w:pStyle w:val="Titre3"/>
       </w:pPr>
-      <w:bookmarkStart w:id="7" w:name="_Toc224836530"/>
+      <w:bookmarkStart w:id="7" w:name="_Toc224925015"/>
       <w:r>
         <w:t>Syntaxe de la fonction TROUVE</w:t>
       </w:r>
@@ -5728,7 +5728,7 @@
       <w:pPr>
         <w:pStyle w:val="Titre3"/>
       </w:pPr>
-      <w:bookmarkStart w:id="8" w:name="_Toc224836531"/>
+      <w:bookmarkStart w:id="8" w:name="_Toc224925016"/>
       <w:r>
         <w:t>Explications :</w:t>
       </w:r>
@@ -5927,7 +5927,7 @@
       <w:pPr>
         <w:pStyle w:val="Titre3"/>
       </w:pPr>
-      <w:bookmarkStart w:id="9" w:name="_Toc224836532"/>
+      <w:bookmarkStart w:id="9" w:name="_Toc224925017"/>
       <w:r>
         <w:t>Syntaxe</w:t>
       </w:r>
@@ -5991,7 +5991,7 @@
       <w:pPr>
         <w:pStyle w:val="Titre4"/>
       </w:pPr>
-      <w:bookmarkStart w:id="10" w:name="_Toc224836533"/>
+      <w:bookmarkStart w:id="10" w:name="_Toc224925018"/>
       <w:r>
         <w:t>Syntaxe de la fonction INDEX</w:t>
       </w:r>
@@ -6543,7 +6543,7 @@
       <w:pPr>
         <w:pStyle w:val="Titre4"/>
       </w:pPr>
-      <w:bookmarkStart w:id="11" w:name="_Toc224836534"/>
+      <w:bookmarkStart w:id="11" w:name="_Toc224925019"/>
       <w:r>
         <w:t>Syntaxe de la fonction INDEX</w:t>
       </w:r>
@@ -7210,7 +7210,7 @@
       <w:pPr>
         <w:pStyle w:val="Titre2"/>
       </w:pPr>
-      <w:bookmarkStart w:id="12" w:name="_Toc224836535"/>
+      <w:bookmarkStart w:id="12" w:name="_Toc224925020"/>
       <w:r>
         <w:t>Avec LIRE.CLASSEUR , TRANSPOSE et SUBSTITUE</w:t>
       </w:r>
@@ -7836,7 +7836,7 @@
       <w:pPr>
         <w:pStyle w:val="Titre3"/>
       </w:pPr>
-      <w:bookmarkStart w:id="13" w:name="_Toc224836536"/>
+      <w:bookmarkStart w:id="13" w:name="_Toc224925021"/>
       <w:r>
         <w:t>Syntaxe de la fonction SUBSTITUE</w:t>
       </w:r>
@@ -8297,7 +8297,7 @@
       <w:pPr>
         <w:pStyle w:val="Titre3"/>
       </w:pPr>
-      <w:bookmarkStart w:id="14" w:name="_Toc224836537"/>
+      <w:bookmarkStart w:id="14" w:name="_Toc224925022"/>
       <w:r>
         <w:t>Syntaxe de la fonction TRANSPOSE</w:t>
       </w:r>
@@ -8746,7 +8746,7 @@
       <w:pPr>
         <w:pStyle w:val="Titre3"/>
       </w:pPr>
-      <w:bookmarkStart w:id="15" w:name="_Toc224836538"/>
+      <w:bookmarkStart w:id="15" w:name="_Toc224925023"/>
       <w:r>
         <w:t>Explications :</w:t>
       </w:r>
@@ -8986,7 +8986,7 @@
       <w:pPr>
         <w:pStyle w:val="Titre2"/>
       </w:pPr>
-      <w:bookmarkStart w:id="16" w:name="_Toc224836539"/>
+      <w:bookmarkStart w:id="16" w:name="_Toc224925024"/>
       <w:r>
         <w:t>Avec LIRE.CLASSEUR, REMPLACER, TROUVE et TRANSPOSE</w:t>
       </w:r>
@@ -9001,7 +9001,7 @@
       <w:pPr>
         <w:pStyle w:val="Titre3"/>
       </w:pPr>
-      <w:bookmarkStart w:id="17" w:name="_Toc224836540"/>
+      <w:bookmarkStart w:id="17" w:name="_Toc224925025"/>
       <w:r>
         <w:t>Étape 1 : Clique</w:t>
       </w:r>
@@ -9142,7 +9142,7 @@
       <w:pPr>
         <w:pStyle w:val="Titre3"/>
       </w:pPr>
-      <w:bookmarkStart w:id="18" w:name="_Toc224836541"/>
+      <w:bookmarkStart w:id="18" w:name="_Toc224925026"/>
       <w:r>
         <w:t>Étape 2 : Modifiez le nom et la formule dans la boîte de dialogue Nouveau nom</w:t>
       </w:r>
@@ -9573,7 +9573,7 @@
       <w:pPr>
         <w:pStyle w:val="Titre3"/>
       </w:pPr>
-      <w:bookmarkStart w:id="19" w:name="_Toc224836542"/>
+      <w:bookmarkStart w:id="19" w:name="_Toc224925027"/>
       <w:r>
         <w:t>Étape 3 : Utilisation d'une formule pour lister les noms des feuilles</w:t>
       </w:r>
@@ -9727,7 +9727,7 @@
       <w:pPr>
         <w:pStyle w:val="Titre2"/>
       </w:pPr>
-      <w:bookmarkStart w:id="20" w:name="_Toc224836543"/>
+      <w:bookmarkStart w:id="20" w:name="_Toc224925028"/>
       <w:r>
         <w:t xml:space="preserve">Avec LIRE.CLASSEUR, </w:t>
       </w:r>
@@ -9902,7 +9902,7 @@
       <w:pPr>
         <w:pStyle w:val="Titre3"/>
       </w:pPr>
-      <w:bookmarkStart w:id="21" w:name="_Toc224836544"/>
+      <w:bookmarkStart w:id="21" w:name="_Toc224925029"/>
       <w:r>
         <w:t>Étape 1 : Clique</w:t>
       </w:r>
@@ -9991,7 +9991,7 @@
       <w:pPr>
         <w:pStyle w:val="Titre3"/>
       </w:pPr>
-      <w:bookmarkStart w:id="22" w:name="_Toc224836545"/>
+      <w:bookmarkStart w:id="22" w:name="_Toc224925030"/>
       <w:r>
         <w:t xml:space="preserve">Étape </w:t>
       </w:r>
@@ -10107,7 +10107,7 @@
       <w:pPr>
         <w:pStyle w:val="Titre3"/>
       </w:pPr>
-      <w:bookmarkStart w:id="23" w:name="_Toc224836546"/>
+      <w:bookmarkStart w:id="23" w:name="_Toc224925031"/>
       <w:r>
         <w:t xml:space="preserve">Étape </w:t>
       </w:r>
@@ -10395,7 +10395,7 @@
       <w:pPr>
         <w:pStyle w:val="Titre3"/>
       </w:pPr>
-      <w:bookmarkStart w:id="24" w:name="_Toc224836547"/>
+      <w:bookmarkStart w:id="24" w:name="_Toc224925032"/>
       <w:r>
         <w:t xml:space="preserve">Étape </w:t>
       </w:r>
@@ -10514,7 +10514,7 @@
       <w:pPr>
         <w:pStyle w:val="Titre4"/>
       </w:pPr>
-      <w:bookmarkStart w:id="25" w:name="_Toc224836548"/>
+      <w:bookmarkStart w:id="25" w:name="_Toc224925033"/>
       <w:r>
         <w:t>Syntaxe de</w:t>
       </w:r>
@@ -10951,7 +10951,7 @@
       <w:pPr>
         <w:pStyle w:val="Titre4"/>
       </w:pPr>
-      <w:bookmarkStart w:id="26" w:name="_Toc224836549"/>
+      <w:bookmarkStart w:id="26" w:name="_Toc224925034"/>
       <w:r>
         <w:t>Explications</w:t>
       </w:r>
@@ -10961,7 +10961,7 @@
       <w:pPr>
         <w:pStyle w:val="Titre4"/>
       </w:pPr>
-      <w:bookmarkStart w:id="27" w:name="_Toc224836550"/>
+      <w:bookmarkStart w:id="27" w:name="_Toc224925035"/>
       <w:r>
         <w:t>Décomposer le résultat de LIRE.CLASSEUR()</w:t>
       </w:r>
@@ -11795,7 +11795,7 @@
       <w:pPr>
         <w:pStyle w:val="Titre4"/>
       </w:pPr>
-      <w:bookmarkStart w:id="28" w:name="_Toc224836551"/>
+      <w:bookmarkStart w:id="28" w:name="_Toc224925036"/>
       <w:r>
         <w:t>Autre solution avec la fonction DROITE()</w:t>
       </w:r>
@@ -12074,7 +12074,7 @@
       <w:pPr>
         <w:pStyle w:val="Titre3"/>
       </w:pPr>
-      <w:bookmarkStart w:id="29" w:name="_Toc224836552"/>
+      <w:bookmarkStart w:id="29" w:name="_Toc224925037"/>
       <w:r>
         <w:t xml:space="preserve">Étape </w:t>
       </w:r>
@@ -12566,7 +12566,7 @@
       <w:pPr>
         <w:pStyle w:val="Titre3"/>
       </w:pPr>
-      <w:bookmarkStart w:id="30" w:name="_Toc224836553"/>
+      <w:bookmarkStart w:id="30" w:name="_Toc224925038"/>
       <w:r>
         <w:lastRenderedPageBreak/>
         <w:t>Étape 6 : Gérer les erreurs #REF ! avec la fonction SIERREUR</w:t>
@@ -12649,7 +12649,7 @@
       <w:pPr>
         <w:pStyle w:val="Titre4"/>
       </w:pPr>
-      <w:bookmarkStart w:id="31" w:name="_Toc224836554"/>
+      <w:bookmarkStart w:id="31" w:name="_Toc224925039"/>
       <w:r>
         <w:t>Syntaxe de la fonction SIERREUR</w:t>
       </w:r>
@@ -13253,7 +13253,7 @@
       <w:pPr>
         <w:pStyle w:val="Titre4"/>
       </w:pPr>
-      <w:bookmarkStart w:id="32" w:name="_Toc224836555"/>
+      <w:bookmarkStart w:id="32" w:name="_Toc224925040"/>
       <w:r>
         <w:t>Modification de la formule pour ne pas compter la feuille Sommaire</w:t>
       </w:r>
@@ -13423,7 +13423,7 @@
       <w:pPr>
         <w:pStyle w:val="Titre2"/>
       </w:pPr>
-      <w:bookmarkStart w:id="33" w:name="_Toc224836556"/>
+      <w:bookmarkStart w:id="33" w:name="_Toc224925041"/>
       <w:r>
         <w:t>Pour aller plus loin</w:t>
       </w:r>
@@ -13433,7 +13433,7 @@
       <w:pPr>
         <w:pStyle w:val="Titre3"/>
       </w:pPr>
-      <w:bookmarkStart w:id="34" w:name="_Toc224836557"/>
+      <w:bookmarkStart w:id="34" w:name="_Toc224925042"/>
       <w:r>
         <w:t>Rendre l'affichage</w:t>
       </w:r>
@@ -13613,7 +13613,7 @@
       <w:pPr>
         <w:pStyle w:val="Titre4"/>
       </w:pPr>
-      <w:bookmarkStart w:id="35" w:name="_Toc224836558"/>
+      <w:bookmarkStart w:id="35" w:name="_Toc224925043"/>
       <w:r>
         <w:t>Avec ALEA et TEXTE</w:t>
       </w:r>
@@ -13649,7 +13649,7 @@
       <w:pPr>
         <w:pStyle w:val="Titre5"/>
       </w:pPr>
-      <w:bookmarkStart w:id="36" w:name="_Toc224836559"/>
+      <w:bookmarkStart w:id="36" w:name="_Toc224925044"/>
       <w:r>
         <w:t xml:space="preserve">Syntaxe de la fonction </w:t>
       </w:r>
@@ -13821,7 +13821,7 @@
       <w:pPr>
         <w:pStyle w:val="Titre5"/>
       </w:pPr>
-      <w:bookmarkStart w:id="37" w:name="_Toc224836560"/>
+      <w:bookmarkStart w:id="37" w:name="_Toc224925045"/>
       <w:r>
         <w:t>Syntaxe de la fonction TEXTE</w:t>
       </w:r>
@@ -14515,7 +14515,7 @@
       <w:pPr>
         <w:pStyle w:val="Titre4"/>
       </w:pPr>
-      <w:bookmarkStart w:id="38" w:name="_Toc224836561"/>
+      <w:bookmarkStart w:id="38" w:name="_Toc224925046"/>
       <w:r>
         <w:t>Avec</w:t>
       </w:r>
@@ -14536,7 +14536,7 @@
       <w:pPr>
         <w:pStyle w:val="Titre5"/>
       </w:pPr>
-      <w:bookmarkStart w:id="39" w:name="_Toc224836562"/>
+      <w:bookmarkStart w:id="39" w:name="_Toc224925047"/>
       <w:r>
         <w:t xml:space="preserve">Syntaxe de la fonction </w:t>
       </w:r>
@@ -14855,7 +14855,7 @@
       <w:pPr>
         <w:pStyle w:val="Titre5"/>
       </w:pPr>
-      <w:bookmarkStart w:id="40" w:name="_Toc224836563"/>
+      <w:bookmarkStart w:id="40" w:name="_Toc224925048"/>
       <w:r>
         <w:t>Syntaxe de la fonction T</w:t>
       </w:r>
@@ -15406,7 +15406,7 @@
       <w:pPr>
         <w:pStyle w:val="Titre3"/>
       </w:pPr>
-      <w:bookmarkStart w:id="41" w:name="_Toc224836564"/>
+      <w:bookmarkStart w:id="41" w:name="_Toc224925049"/>
       <w:r>
         <w:t>On peut ajouter des liens hypertexte sur le nom des feuilles.</w:t>
       </w:r>
@@ -15421,7 +15421,7 @@
       <w:pPr>
         <w:pStyle w:val="Titre4"/>
       </w:pPr>
-      <w:bookmarkStart w:id="42" w:name="_Toc224836565"/>
+      <w:bookmarkStart w:id="42" w:name="_Toc224925050"/>
       <w:r>
         <w:t>Ajouter des liens hypertexte manuellement</w:t>
       </w:r>
@@ -15472,7 +15472,7 @@
       <w:pPr>
         <w:pStyle w:val="Titre5"/>
       </w:pPr>
-      <w:bookmarkStart w:id="43" w:name="_Toc224836566"/>
+      <w:bookmarkStart w:id="43" w:name="_Toc224925051"/>
       <w:r>
         <w:lastRenderedPageBreak/>
         <w:t>Insérer des liens hypertextes sur les noms figurant dans le sommaire</w:t>
@@ -15970,7 +15970,7 @@
       <w:pPr>
         <w:pStyle w:val="Titre5"/>
       </w:pPr>
-      <w:bookmarkStart w:id="44" w:name="_Toc224836567"/>
+      <w:bookmarkStart w:id="44" w:name="_Toc224925052"/>
       <w:r>
         <w:t xml:space="preserve">Insérer une icône et </w:t>
       </w:r>
@@ -16862,7 +16862,7 @@
       <w:pPr>
         <w:pStyle w:val="Titre4"/>
       </w:pPr>
-      <w:bookmarkStart w:id="45" w:name="_Toc224836568"/>
+      <w:bookmarkStart w:id="45" w:name="_Toc224925053"/>
       <w:r>
         <w:t>Transition vers le VBA : ajouter des liens hypertexte par code</w:t>
       </w:r>
@@ -16908,7 +16908,7 @@
       <w:pPr>
         <w:pStyle w:val="Titre5"/>
       </w:pPr>
-      <w:bookmarkStart w:id="46" w:name="_Toc224836569"/>
+      <w:bookmarkStart w:id="46" w:name="_Toc224925054"/>
       <w:r>
         <w:t>Syntaxe VBA pour un hyperlien</w:t>
       </w:r>
@@ -17618,7 +17618,7 @@
       <w:pPr>
         <w:pStyle w:val="Titre5"/>
       </w:pPr>
-      <w:bookmarkStart w:id="47" w:name="_Toc224836570"/>
+      <w:bookmarkStart w:id="47" w:name="_Toc224925055"/>
       <w:r>
         <w:t>Ajouter un index hyperlien des feuilles dans le classeur</w:t>
       </w:r>
@@ -19907,7 +19907,7 @@
       <w:pPr>
         <w:pStyle w:val="Titre5"/>
       </w:pPr>
-      <w:bookmarkStart w:id="48" w:name="_Toc224836571"/>
+      <w:bookmarkStart w:id="48" w:name="_Toc224925056"/>
       <w:r>
         <w:t>Le principe DRY</w:t>
       </w:r>
@@ -20150,7 +20150,7 @@
           <w:highlight w:val="yellow"/>
         </w:rPr>
       </w:pPr>
-      <w:bookmarkStart w:id="49" w:name="_Toc224836572"/>
+      <w:bookmarkStart w:id="49" w:name="_Toc224925057"/>
       <w:r>
         <w:rPr>
           <w:b/>
@@ -20263,7 +20263,11 @@
           <w:tcPr>
             <w:tcW w:w="4531" w:type="dxa"/>
           </w:tcPr>
-          <w:p/>
+          <w:p>
+            <w:r>
+              <w:t>RAND</w:t>
+            </w:r>
+          </w:p>
         </w:tc>
       </w:tr>
       <w:tr>
@@ -20444,7 +20448,7 @@
         <w:pStyle w:val="Titre1"/>
       </w:pPr>
       <w:bookmarkStart w:id="50" w:name="_Toc223707034"/>
-      <w:bookmarkStart w:id="51" w:name="_Toc224836573"/>
+      <w:bookmarkStart w:id="51" w:name="_Toc224925058"/>
       <w:r>
         <w:t>Links</w:t>
       </w:r>
@@ -21437,7 +21441,7 @@
               <w:sz w:val="16"/>
               <w:szCs w:val="16"/>
             </w:rPr>
-            <w:t>19-03-2026 17:55</w:t>
+            <w:t>19-03-2026 18:15</w:t>
           </w:r>
           <w:r>
             <w:rPr>

</xml_diff>

<commit_message>
03/20 Aid DataTableDesignTsp+VBE+Admin+FunXL 2
</commit_message>
<xml_diff>
--- a/EXCEL_CodeSource/Classeurs_CodeSource/SheetsList/Lister le nom des feuilles dans Excel.docx
+++ b/EXCEL_CodeSource/Classeurs_CodeSource/SheetsList/Lister le nom des feuilles dans Excel.docx
@@ -152,7 +152,7 @@
       <w:r>
         <w:fldChar w:fldCharType="separate"/>
       </w:r>
-      <w:hyperlink w:anchor="_Toc224925008" w:history="1">
+      <w:hyperlink w:anchor="_Toc224925289" w:history="1">
         <w:r>
           <w:rPr>
             <w:rStyle w:val="Lienhypertexte"/>
@@ -179,7 +179,7 @@
             <w:noProof/>
             <w:webHidden/>
           </w:rPr>
-          <w:instrText xml:space="preserve"> PAGEREF _Toc224925008 \h </w:instrText>
+          <w:instrText xml:space="preserve"> PAGEREF _Toc224925289 \h </w:instrText>
         </w:r>
         <w:r>
           <w:rPr>
@@ -226,7 +226,7 @@
           <w14:ligatures w14:val="standardContextual"/>
         </w:rPr>
       </w:pPr>
-      <w:hyperlink w:anchor="_Toc224925009" w:history="1">
+      <w:hyperlink w:anchor="_Toc224925290" w:history="1">
         <w:r>
           <w:rPr>
             <w:rStyle w:val="Lienhypertexte"/>
@@ -253,7 +253,7 @@
             <w:noProof/>
             <w:webHidden/>
           </w:rPr>
-          <w:instrText xml:space="preserve"> PAGEREF _Toc224925009 \h </w:instrText>
+          <w:instrText xml:space="preserve"> PAGEREF _Toc224925290 \h </w:instrText>
         </w:r>
         <w:r>
           <w:rPr>
@@ -300,7 +300,7 @@
           <w14:ligatures w14:val="standardContextual"/>
         </w:rPr>
       </w:pPr>
-      <w:hyperlink w:anchor="_Toc224925010" w:history="1">
+      <w:hyperlink w:anchor="_Toc224925291" w:history="1">
         <w:r>
           <w:rPr>
             <w:rStyle w:val="Lienhypertexte"/>
@@ -327,7 +327,7 @@
             <w:noProof/>
             <w:webHidden/>
           </w:rPr>
-          <w:instrText xml:space="preserve"> PAGEREF _Toc224925010 \h </w:instrText>
+          <w:instrText xml:space="preserve"> PAGEREF _Toc224925291 \h </w:instrText>
         </w:r>
         <w:r>
           <w:rPr>
@@ -374,7 +374,7 @@
           <w14:ligatures w14:val="standardContextual"/>
         </w:rPr>
       </w:pPr>
-      <w:hyperlink w:anchor="_Toc224925011" w:history="1">
+      <w:hyperlink w:anchor="_Toc224925292" w:history="1">
         <w:r>
           <w:rPr>
             <w:rStyle w:val="Lienhypertexte"/>
@@ -401,7 +401,7 @@
             <w:noProof/>
             <w:webHidden/>
           </w:rPr>
-          <w:instrText xml:space="preserve"> PAGEREF _Toc224925011 \h </w:instrText>
+          <w:instrText xml:space="preserve"> PAGEREF _Toc224925292 \h </w:instrText>
         </w:r>
         <w:r>
           <w:rPr>
@@ -450,7 +450,7 @@
           <w14:ligatures w14:val="standardContextual"/>
         </w:rPr>
       </w:pPr>
-      <w:hyperlink w:anchor="_Toc224925012" w:history="1">
+      <w:hyperlink w:anchor="_Toc224925293" w:history="1">
         <w:r>
           <w:rPr>
             <w:rStyle w:val="Lienhypertexte"/>
@@ -477,7 +477,7 @@
             <w:noProof/>
             <w:webHidden/>
           </w:rPr>
-          <w:instrText xml:space="preserve"> PAGEREF _Toc224925012 \h </w:instrText>
+          <w:instrText xml:space="preserve"> PAGEREF _Toc224925293 \h </w:instrText>
         </w:r>
         <w:r>
           <w:rPr>
@@ -524,7 +524,7 @@
           <w14:ligatures w14:val="standardContextual"/>
         </w:rPr>
       </w:pPr>
-      <w:hyperlink w:anchor="_Toc224925013" w:history="1">
+      <w:hyperlink w:anchor="_Toc224925294" w:history="1">
         <w:r>
           <w:rPr>
             <w:rStyle w:val="Lienhypertexte"/>
@@ -551,7 +551,7 @@
             <w:noProof/>
             <w:webHidden/>
           </w:rPr>
-          <w:instrText xml:space="preserve"> PAGEREF _Toc224925013 \h </w:instrText>
+          <w:instrText xml:space="preserve"> PAGEREF _Toc224925294 \h </w:instrText>
         </w:r>
         <w:r>
           <w:rPr>
@@ -599,7 +599,7 @@
           <w14:ligatures w14:val="standardContextual"/>
         </w:rPr>
       </w:pPr>
-      <w:hyperlink w:anchor="_Toc224925014" w:history="1">
+      <w:hyperlink w:anchor="_Toc224925295" w:history="1">
         <w:r>
           <w:rPr>
             <w:rStyle w:val="Lienhypertexte"/>
@@ -626,7 +626,7 @@
             <w:noProof/>
             <w:webHidden/>
           </w:rPr>
-          <w:instrText xml:space="preserve"> PAGEREF _Toc224925014 \h </w:instrText>
+          <w:instrText xml:space="preserve"> PAGEREF _Toc224925295 \h </w:instrText>
         </w:r>
         <w:r>
           <w:rPr>
@@ -674,7 +674,7 @@
           <w14:ligatures w14:val="standardContextual"/>
         </w:rPr>
       </w:pPr>
-      <w:hyperlink w:anchor="_Toc224925015" w:history="1">
+      <w:hyperlink w:anchor="_Toc224925296" w:history="1">
         <w:r>
           <w:rPr>
             <w:rStyle w:val="Lienhypertexte"/>
@@ -701,7 +701,7 @@
             <w:noProof/>
             <w:webHidden/>
           </w:rPr>
-          <w:instrText xml:space="preserve"> PAGEREF _Toc224925015 \h </w:instrText>
+          <w:instrText xml:space="preserve"> PAGEREF _Toc224925296 \h </w:instrText>
         </w:r>
         <w:r>
           <w:rPr>
@@ -749,7 +749,7 @@
           <w14:ligatures w14:val="standardContextual"/>
         </w:rPr>
       </w:pPr>
-      <w:hyperlink w:anchor="_Toc224925016" w:history="1">
+      <w:hyperlink w:anchor="_Toc224925297" w:history="1">
         <w:r>
           <w:rPr>
             <w:rStyle w:val="Lienhypertexte"/>
@@ -776,7 +776,7 @@
             <w:noProof/>
             <w:webHidden/>
           </w:rPr>
-          <w:instrText xml:space="preserve"> PAGEREF _Toc224925016 \h </w:instrText>
+          <w:instrText xml:space="preserve"> PAGEREF _Toc224925297 \h </w:instrText>
         </w:r>
         <w:r>
           <w:rPr>
@@ -824,7 +824,7 @@
           <w14:ligatures w14:val="standardContextual"/>
         </w:rPr>
       </w:pPr>
-      <w:hyperlink w:anchor="_Toc224925017" w:history="1">
+      <w:hyperlink w:anchor="_Toc224925298" w:history="1">
         <w:r>
           <w:rPr>
             <w:rStyle w:val="Lienhypertexte"/>
@@ -851,7 +851,7 @@
             <w:noProof/>
             <w:webHidden/>
           </w:rPr>
-          <w:instrText xml:space="preserve"> PAGEREF _Toc224925017 \h </w:instrText>
+          <w:instrText xml:space="preserve"> PAGEREF _Toc224925298 \h </w:instrText>
         </w:r>
         <w:r>
           <w:rPr>
@@ -898,7 +898,7 @@
           <w14:ligatures w14:val="standardContextual"/>
         </w:rPr>
       </w:pPr>
-      <w:hyperlink w:anchor="_Toc224925018" w:history="1">
+      <w:hyperlink w:anchor="_Toc224925299" w:history="1">
         <w:r>
           <w:rPr>
             <w:rStyle w:val="Lienhypertexte"/>
@@ -925,7 +925,7 @@
             <w:noProof/>
             <w:webHidden/>
           </w:rPr>
-          <w:instrText xml:space="preserve"> PAGEREF _Toc224925018 \h </w:instrText>
+          <w:instrText xml:space="preserve"> PAGEREF _Toc224925299 \h </w:instrText>
         </w:r>
         <w:r>
           <w:rPr>
@@ -972,7 +972,7 @@
           <w14:ligatures w14:val="standardContextual"/>
         </w:rPr>
       </w:pPr>
-      <w:hyperlink w:anchor="_Toc224925019" w:history="1">
+      <w:hyperlink w:anchor="_Toc224925300" w:history="1">
         <w:r>
           <w:rPr>
             <w:rStyle w:val="Lienhypertexte"/>
@@ -999,7 +999,7 @@
             <w:noProof/>
             <w:webHidden/>
           </w:rPr>
-          <w:instrText xml:space="preserve"> PAGEREF _Toc224925019 \h </w:instrText>
+          <w:instrText xml:space="preserve"> PAGEREF _Toc224925300 \h </w:instrText>
         </w:r>
         <w:r>
           <w:rPr>
@@ -1046,7 +1046,7 @@
           <w14:ligatures w14:val="standardContextual"/>
         </w:rPr>
       </w:pPr>
-      <w:hyperlink w:anchor="_Toc224925020" w:history="1">
+      <w:hyperlink w:anchor="_Toc224925301" w:history="1">
         <w:r>
           <w:rPr>
             <w:rStyle w:val="Lienhypertexte"/>
@@ -1073,7 +1073,7 @@
             <w:noProof/>
             <w:webHidden/>
           </w:rPr>
-          <w:instrText xml:space="preserve"> PAGEREF _Toc224925020 \h </w:instrText>
+          <w:instrText xml:space="preserve"> PAGEREF _Toc224925301 \h </w:instrText>
         </w:r>
         <w:r>
           <w:rPr>
@@ -1121,7 +1121,7 @@
           <w14:ligatures w14:val="standardContextual"/>
         </w:rPr>
       </w:pPr>
-      <w:hyperlink w:anchor="_Toc224925021" w:history="1">
+      <w:hyperlink w:anchor="_Toc224925302" w:history="1">
         <w:r>
           <w:rPr>
             <w:rStyle w:val="Lienhypertexte"/>
@@ -1148,7 +1148,7 @@
             <w:noProof/>
             <w:webHidden/>
           </w:rPr>
-          <w:instrText xml:space="preserve"> PAGEREF _Toc224925021 \h </w:instrText>
+          <w:instrText xml:space="preserve"> PAGEREF _Toc224925302 \h </w:instrText>
         </w:r>
         <w:r>
           <w:rPr>
@@ -1196,7 +1196,7 @@
           <w14:ligatures w14:val="standardContextual"/>
         </w:rPr>
       </w:pPr>
-      <w:hyperlink w:anchor="_Toc224925022" w:history="1">
+      <w:hyperlink w:anchor="_Toc224925303" w:history="1">
         <w:r>
           <w:rPr>
             <w:rStyle w:val="Lienhypertexte"/>
@@ -1223,7 +1223,7 @@
             <w:noProof/>
             <w:webHidden/>
           </w:rPr>
-          <w:instrText xml:space="preserve"> PAGEREF _Toc224925022 \h </w:instrText>
+          <w:instrText xml:space="preserve"> PAGEREF _Toc224925303 \h </w:instrText>
         </w:r>
         <w:r>
           <w:rPr>
@@ -1271,7 +1271,7 @@
           <w14:ligatures w14:val="standardContextual"/>
         </w:rPr>
       </w:pPr>
-      <w:hyperlink w:anchor="_Toc224925023" w:history="1">
+      <w:hyperlink w:anchor="_Toc224925304" w:history="1">
         <w:r>
           <w:rPr>
             <w:rStyle w:val="Lienhypertexte"/>
@@ -1298,7 +1298,7 @@
             <w:noProof/>
             <w:webHidden/>
           </w:rPr>
-          <w:instrText xml:space="preserve"> PAGEREF _Toc224925023 \h </w:instrText>
+          <w:instrText xml:space="preserve"> PAGEREF _Toc224925304 \h </w:instrText>
         </w:r>
         <w:r>
           <w:rPr>
@@ -1345,7 +1345,7 @@
           <w14:ligatures w14:val="standardContextual"/>
         </w:rPr>
       </w:pPr>
-      <w:hyperlink w:anchor="_Toc224925024" w:history="1">
+      <w:hyperlink w:anchor="_Toc224925305" w:history="1">
         <w:r>
           <w:rPr>
             <w:rStyle w:val="Lienhypertexte"/>
@@ -1372,7 +1372,7 @@
             <w:noProof/>
             <w:webHidden/>
           </w:rPr>
-          <w:instrText xml:space="preserve"> PAGEREF _Toc224925024 \h </w:instrText>
+          <w:instrText xml:space="preserve"> PAGEREF _Toc224925305 \h </w:instrText>
         </w:r>
         <w:r>
           <w:rPr>
@@ -1420,7 +1420,7 @@
           <w14:ligatures w14:val="standardContextual"/>
         </w:rPr>
       </w:pPr>
-      <w:hyperlink w:anchor="_Toc224925025" w:history="1">
+      <w:hyperlink w:anchor="_Toc224925306" w:history="1">
         <w:r>
           <w:rPr>
             <w:rStyle w:val="Lienhypertexte"/>
@@ -1447,7 +1447,7 @@
             <w:noProof/>
             <w:webHidden/>
           </w:rPr>
-          <w:instrText xml:space="preserve"> PAGEREF _Toc224925025 \h </w:instrText>
+          <w:instrText xml:space="preserve"> PAGEREF _Toc224925306 \h </w:instrText>
         </w:r>
         <w:r>
           <w:rPr>
@@ -1495,7 +1495,7 @@
           <w14:ligatures w14:val="standardContextual"/>
         </w:rPr>
       </w:pPr>
-      <w:hyperlink w:anchor="_Toc224925026" w:history="1">
+      <w:hyperlink w:anchor="_Toc224925307" w:history="1">
         <w:r>
           <w:rPr>
             <w:rStyle w:val="Lienhypertexte"/>
@@ -1522,7 +1522,7 @@
             <w:noProof/>
             <w:webHidden/>
           </w:rPr>
-          <w:instrText xml:space="preserve"> PAGEREF _Toc224925026 \h </w:instrText>
+          <w:instrText xml:space="preserve"> PAGEREF _Toc224925307 \h </w:instrText>
         </w:r>
         <w:r>
           <w:rPr>
@@ -1570,7 +1570,7 @@
           <w14:ligatures w14:val="standardContextual"/>
         </w:rPr>
       </w:pPr>
-      <w:hyperlink w:anchor="_Toc224925027" w:history="1">
+      <w:hyperlink w:anchor="_Toc224925308" w:history="1">
         <w:r>
           <w:rPr>
             <w:rStyle w:val="Lienhypertexte"/>
@@ -1597,7 +1597,7 @@
             <w:noProof/>
             <w:webHidden/>
           </w:rPr>
-          <w:instrText xml:space="preserve"> PAGEREF _Toc224925027 \h </w:instrText>
+          <w:instrText xml:space="preserve"> PAGEREF _Toc224925308 \h </w:instrText>
         </w:r>
         <w:r>
           <w:rPr>
@@ -1644,7 +1644,7 @@
           <w14:ligatures w14:val="standardContextual"/>
         </w:rPr>
       </w:pPr>
-      <w:hyperlink w:anchor="_Toc224925028" w:history="1">
+      <w:hyperlink w:anchor="_Toc224925309" w:history="1">
         <w:r>
           <w:rPr>
             <w:rStyle w:val="Lienhypertexte"/>
@@ -1671,7 +1671,7 @@
             <w:noProof/>
             <w:webHidden/>
           </w:rPr>
-          <w:instrText xml:space="preserve"> PAGEREF _Toc224925028 \h </w:instrText>
+          <w:instrText xml:space="preserve"> PAGEREF _Toc224925309 \h </w:instrText>
         </w:r>
         <w:r>
           <w:rPr>
@@ -1719,7 +1719,7 @@
           <w14:ligatures w14:val="standardContextual"/>
         </w:rPr>
       </w:pPr>
-      <w:hyperlink w:anchor="_Toc224925029" w:history="1">
+      <w:hyperlink w:anchor="_Toc224925310" w:history="1">
         <w:r>
           <w:rPr>
             <w:rStyle w:val="Lienhypertexte"/>
@@ -1746,7 +1746,7 @@
             <w:noProof/>
             <w:webHidden/>
           </w:rPr>
-          <w:instrText xml:space="preserve"> PAGEREF _Toc224925029 \h </w:instrText>
+          <w:instrText xml:space="preserve"> PAGEREF _Toc224925310 \h </w:instrText>
         </w:r>
         <w:r>
           <w:rPr>
@@ -1794,7 +1794,7 @@
           <w14:ligatures w14:val="standardContextual"/>
         </w:rPr>
       </w:pPr>
-      <w:hyperlink w:anchor="_Toc224925030" w:history="1">
+      <w:hyperlink w:anchor="_Toc224925311" w:history="1">
         <w:r>
           <w:rPr>
             <w:rStyle w:val="Lienhypertexte"/>
@@ -1821,7 +1821,7 @@
             <w:noProof/>
             <w:webHidden/>
           </w:rPr>
-          <w:instrText xml:space="preserve"> PAGEREF _Toc224925030 \h </w:instrText>
+          <w:instrText xml:space="preserve"> PAGEREF _Toc224925311 \h </w:instrText>
         </w:r>
         <w:r>
           <w:rPr>
@@ -1869,7 +1869,7 @@
           <w14:ligatures w14:val="standardContextual"/>
         </w:rPr>
       </w:pPr>
-      <w:hyperlink w:anchor="_Toc224925031" w:history="1">
+      <w:hyperlink w:anchor="_Toc224925312" w:history="1">
         <w:r>
           <w:rPr>
             <w:rStyle w:val="Lienhypertexte"/>
@@ -1896,7 +1896,7 @@
             <w:noProof/>
             <w:webHidden/>
           </w:rPr>
-          <w:instrText xml:space="preserve"> PAGEREF _Toc224925031 \h </w:instrText>
+          <w:instrText xml:space="preserve"> PAGEREF _Toc224925312 \h </w:instrText>
         </w:r>
         <w:r>
           <w:rPr>
@@ -1944,7 +1944,7 @@
           <w14:ligatures w14:val="standardContextual"/>
         </w:rPr>
       </w:pPr>
-      <w:hyperlink w:anchor="_Toc224925032" w:history="1">
+      <w:hyperlink w:anchor="_Toc224925313" w:history="1">
         <w:r>
           <w:rPr>
             <w:rStyle w:val="Lienhypertexte"/>
@@ -1971,7 +1971,7 @@
             <w:noProof/>
             <w:webHidden/>
           </w:rPr>
-          <w:instrText xml:space="preserve"> PAGEREF _Toc224925032 \h </w:instrText>
+          <w:instrText xml:space="preserve"> PAGEREF _Toc224925313 \h </w:instrText>
         </w:r>
         <w:r>
           <w:rPr>
@@ -2018,7 +2018,7 @@
           <w14:ligatures w14:val="standardContextual"/>
         </w:rPr>
       </w:pPr>
-      <w:hyperlink w:anchor="_Toc224925033" w:history="1">
+      <w:hyperlink w:anchor="_Toc224925314" w:history="1">
         <w:r>
           <w:rPr>
             <w:rStyle w:val="Lienhypertexte"/>
@@ -2045,7 +2045,7 @@
             <w:noProof/>
             <w:webHidden/>
           </w:rPr>
-          <w:instrText xml:space="preserve"> PAGEREF _Toc224925033 \h </w:instrText>
+          <w:instrText xml:space="preserve"> PAGEREF _Toc224925314 \h </w:instrText>
         </w:r>
         <w:r>
           <w:rPr>
@@ -2092,7 +2092,7 @@
           <w14:ligatures w14:val="standardContextual"/>
         </w:rPr>
       </w:pPr>
-      <w:hyperlink w:anchor="_Toc224925034" w:history="1">
+      <w:hyperlink w:anchor="_Toc224925315" w:history="1">
         <w:r>
           <w:rPr>
             <w:rStyle w:val="Lienhypertexte"/>
@@ -2119,7 +2119,7 @@
             <w:noProof/>
             <w:webHidden/>
           </w:rPr>
-          <w:instrText xml:space="preserve"> PAGEREF _Toc224925034 \h </w:instrText>
+          <w:instrText xml:space="preserve"> PAGEREF _Toc224925315 \h </w:instrText>
         </w:r>
         <w:r>
           <w:rPr>
@@ -2166,7 +2166,7 @@
           <w14:ligatures w14:val="standardContextual"/>
         </w:rPr>
       </w:pPr>
-      <w:hyperlink w:anchor="_Toc224925035" w:history="1">
+      <w:hyperlink w:anchor="_Toc224925316" w:history="1">
         <w:r>
           <w:rPr>
             <w:rStyle w:val="Lienhypertexte"/>
@@ -2193,7 +2193,7 @@
             <w:noProof/>
             <w:webHidden/>
           </w:rPr>
-          <w:instrText xml:space="preserve"> PAGEREF _Toc224925035 \h </w:instrText>
+          <w:instrText xml:space="preserve"> PAGEREF _Toc224925316 \h </w:instrText>
         </w:r>
         <w:r>
           <w:rPr>
@@ -2240,7 +2240,7 @@
           <w14:ligatures w14:val="standardContextual"/>
         </w:rPr>
       </w:pPr>
-      <w:hyperlink w:anchor="_Toc224925036" w:history="1">
+      <w:hyperlink w:anchor="_Toc224925317" w:history="1">
         <w:r>
           <w:rPr>
             <w:rStyle w:val="Lienhypertexte"/>
@@ -2267,7 +2267,7 @@
             <w:noProof/>
             <w:webHidden/>
           </w:rPr>
-          <w:instrText xml:space="preserve"> PAGEREF _Toc224925036 \h </w:instrText>
+          <w:instrText xml:space="preserve"> PAGEREF _Toc224925317 \h </w:instrText>
         </w:r>
         <w:r>
           <w:rPr>
@@ -2315,7 +2315,7 @@
           <w14:ligatures w14:val="standardContextual"/>
         </w:rPr>
       </w:pPr>
-      <w:hyperlink w:anchor="_Toc224925037" w:history="1">
+      <w:hyperlink w:anchor="_Toc224925318" w:history="1">
         <w:r>
           <w:rPr>
             <w:rStyle w:val="Lienhypertexte"/>
@@ -2342,7 +2342,7 @@
             <w:noProof/>
             <w:webHidden/>
           </w:rPr>
-          <w:instrText xml:space="preserve"> PAGEREF _Toc224925037 \h </w:instrText>
+          <w:instrText xml:space="preserve"> PAGEREF _Toc224925318 \h </w:instrText>
         </w:r>
         <w:r>
           <w:rPr>
@@ -2390,7 +2390,7 @@
           <w14:ligatures w14:val="standardContextual"/>
         </w:rPr>
       </w:pPr>
-      <w:hyperlink w:anchor="_Toc224925038" w:history="1">
+      <w:hyperlink w:anchor="_Toc224925319" w:history="1">
         <w:r>
           <w:rPr>
             <w:rStyle w:val="Lienhypertexte"/>
@@ -2417,7 +2417,7 @@
             <w:noProof/>
             <w:webHidden/>
           </w:rPr>
-          <w:instrText xml:space="preserve"> PAGEREF _Toc224925038 \h </w:instrText>
+          <w:instrText xml:space="preserve"> PAGEREF _Toc224925319 \h </w:instrText>
         </w:r>
         <w:r>
           <w:rPr>
@@ -2464,7 +2464,7 @@
           <w14:ligatures w14:val="standardContextual"/>
         </w:rPr>
       </w:pPr>
-      <w:hyperlink w:anchor="_Toc224925039" w:history="1">
+      <w:hyperlink w:anchor="_Toc224925320" w:history="1">
         <w:r>
           <w:rPr>
             <w:rStyle w:val="Lienhypertexte"/>
@@ -2491,7 +2491,7 @@
             <w:noProof/>
             <w:webHidden/>
           </w:rPr>
-          <w:instrText xml:space="preserve"> PAGEREF _Toc224925039 \h </w:instrText>
+          <w:instrText xml:space="preserve"> PAGEREF _Toc224925320 \h </w:instrText>
         </w:r>
         <w:r>
           <w:rPr>
@@ -2538,7 +2538,7 @@
           <w14:ligatures w14:val="standardContextual"/>
         </w:rPr>
       </w:pPr>
-      <w:hyperlink w:anchor="_Toc224925040" w:history="1">
+      <w:hyperlink w:anchor="_Toc224925321" w:history="1">
         <w:r>
           <w:rPr>
             <w:rStyle w:val="Lienhypertexte"/>
@@ -2565,7 +2565,7 @@
             <w:noProof/>
             <w:webHidden/>
           </w:rPr>
-          <w:instrText xml:space="preserve"> PAGEREF _Toc224925040 \h </w:instrText>
+          <w:instrText xml:space="preserve"> PAGEREF _Toc224925321 \h </w:instrText>
         </w:r>
         <w:r>
           <w:rPr>
@@ -2612,7 +2612,7 @@
           <w14:ligatures w14:val="standardContextual"/>
         </w:rPr>
       </w:pPr>
-      <w:hyperlink w:anchor="_Toc224925041" w:history="1">
+      <w:hyperlink w:anchor="_Toc224925322" w:history="1">
         <w:r>
           <w:rPr>
             <w:rStyle w:val="Lienhypertexte"/>
@@ -2639,7 +2639,7 @@
             <w:noProof/>
             <w:webHidden/>
           </w:rPr>
-          <w:instrText xml:space="preserve"> PAGEREF _Toc224925041 \h </w:instrText>
+          <w:instrText xml:space="preserve"> PAGEREF _Toc224925322 \h </w:instrText>
         </w:r>
         <w:r>
           <w:rPr>
@@ -2687,7 +2687,7 @@
           <w14:ligatures w14:val="standardContextual"/>
         </w:rPr>
       </w:pPr>
-      <w:hyperlink w:anchor="_Toc224925042" w:history="1">
+      <w:hyperlink w:anchor="_Toc224925323" w:history="1">
         <w:r>
           <w:rPr>
             <w:rStyle w:val="Lienhypertexte"/>
@@ -2714,7 +2714,7 @@
             <w:noProof/>
             <w:webHidden/>
           </w:rPr>
-          <w:instrText xml:space="preserve"> PAGEREF _Toc224925042 \h </w:instrText>
+          <w:instrText xml:space="preserve"> PAGEREF _Toc224925323 \h </w:instrText>
         </w:r>
         <w:r>
           <w:rPr>
@@ -2761,7 +2761,7 @@
           <w14:ligatures w14:val="standardContextual"/>
         </w:rPr>
       </w:pPr>
-      <w:hyperlink w:anchor="_Toc224925043" w:history="1">
+      <w:hyperlink w:anchor="_Toc224925324" w:history="1">
         <w:r>
           <w:rPr>
             <w:rStyle w:val="Lienhypertexte"/>
@@ -2788,7 +2788,7 @@
             <w:noProof/>
             <w:webHidden/>
           </w:rPr>
-          <w:instrText xml:space="preserve"> PAGEREF _Toc224925043 \h </w:instrText>
+          <w:instrText xml:space="preserve"> PAGEREF _Toc224925324 \h </w:instrText>
         </w:r>
         <w:r>
           <w:rPr>
@@ -2835,7 +2835,7 @@
           <w14:ligatures w14:val="standardContextual"/>
         </w:rPr>
       </w:pPr>
-      <w:hyperlink w:anchor="_Toc224925044" w:history="1">
+      <w:hyperlink w:anchor="_Toc224925325" w:history="1">
         <w:r>
           <w:rPr>
             <w:rStyle w:val="Lienhypertexte"/>
@@ -2862,7 +2862,7 @@
             <w:noProof/>
             <w:webHidden/>
           </w:rPr>
-          <w:instrText xml:space="preserve"> PAGEREF _Toc224925044 \h </w:instrText>
+          <w:instrText xml:space="preserve"> PAGEREF _Toc224925325 \h </w:instrText>
         </w:r>
         <w:r>
           <w:rPr>
@@ -2909,7 +2909,7 @@
           <w14:ligatures w14:val="standardContextual"/>
         </w:rPr>
       </w:pPr>
-      <w:hyperlink w:anchor="_Toc224925045" w:history="1">
+      <w:hyperlink w:anchor="_Toc224925326" w:history="1">
         <w:r>
           <w:rPr>
             <w:rStyle w:val="Lienhypertexte"/>
@@ -2936,7 +2936,7 @@
             <w:noProof/>
             <w:webHidden/>
           </w:rPr>
-          <w:instrText xml:space="preserve"> PAGEREF _Toc224925045 \h </w:instrText>
+          <w:instrText xml:space="preserve"> PAGEREF _Toc224925326 \h </w:instrText>
         </w:r>
         <w:r>
           <w:rPr>
@@ -2983,7 +2983,7 @@
           <w14:ligatures w14:val="standardContextual"/>
         </w:rPr>
       </w:pPr>
-      <w:hyperlink w:anchor="_Toc224925046" w:history="1">
+      <w:hyperlink w:anchor="_Toc224925327" w:history="1">
         <w:r>
           <w:rPr>
             <w:rStyle w:val="Lienhypertexte"/>
@@ -3010,7 +3010,7 @@
             <w:noProof/>
             <w:webHidden/>
           </w:rPr>
-          <w:instrText xml:space="preserve"> PAGEREF _Toc224925046 \h </w:instrText>
+          <w:instrText xml:space="preserve"> PAGEREF _Toc224925327 \h </w:instrText>
         </w:r>
         <w:r>
           <w:rPr>
@@ -3057,7 +3057,7 @@
           <w14:ligatures w14:val="standardContextual"/>
         </w:rPr>
       </w:pPr>
-      <w:hyperlink w:anchor="_Toc224925047" w:history="1">
+      <w:hyperlink w:anchor="_Toc224925328" w:history="1">
         <w:r>
           <w:rPr>
             <w:rStyle w:val="Lienhypertexte"/>
@@ -3084,7 +3084,7 @@
             <w:noProof/>
             <w:webHidden/>
           </w:rPr>
-          <w:instrText xml:space="preserve"> PAGEREF _Toc224925047 \h </w:instrText>
+          <w:instrText xml:space="preserve"> PAGEREF _Toc224925328 \h </w:instrText>
         </w:r>
         <w:r>
           <w:rPr>
@@ -3131,7 +3131,7 @@
           <w14:ligatures w14:val="standardContextual"/>
         </w:rPr>
       </w:pPr>
-      <w:hyperlink w:anchor="_Toc224925048" w:history="1">
+      <w:hyperlink w:anchor="_Toc224925329" w:history="1">
         <w:r>
           <w:rPr>
             <w:rStyle w:val="Lienhypertexte"/>
@@ -3158,7 +3158,7 @@
             <w:noProof/>
             <w:webHidden/>
           </w:rPr>
-          <w:instrText xml:space="preserve"> PAGEREF _Toc224925048 \h </w:instrText>
+          <w:instrText xml:space="preserve"> PAGEREF _Toc224925329 \h </w:instrText>
         </w:r>
         <w:r>
           <w:rPr>
@@ -3206,7 +3206,7 @@
           <w14:ligatures w14:val="standardContextual"/>
         </w:rPr>
       </w:pPr>
-      <w:hyperlink w:anchor="_Toc224925049" w:history="1">
+      <w:hyperlink w:anchor="_Toc224925330" w:history="1">
         <w:r>
           <w:rPr>
             <w:rStyle w:val="Lienhypertexte"/>
@@ -3233,7 +3233,7 @@
             <w:noProof/>
             <w:webHidden/>
           </w:rPr>
-          <w:instrText xml:space="preserve"> PAGEREF _Toc224925049 \h </w:instrText>
+          <w:instrText xml:space="preserve"> PAGEREF _Toc224925330 \h </w:instrText>
         </w:r>
         <w:r>
           <w:rPr>
@@ -3280,7 +3280,7 @@
           <w14:ligatures w14:val="standardContextual"/>
         </w:rPr>
       </w:pPr>
-      <w:hyperlink w:anchor="_Toc224925050" w:history="1">
+      <w:hyperlink w:anchor="_Toc224925331" w:history="1">
         <w:r>
           <w:rPr>
             <w:rStyle w:val="Lienhypertexte"/>
@@ -3307,7 +3307,7 @@
             <w:noProof/>
             <w:webHidden/>
           </w:rPr>
-          <w:instrText xml:space="preserve"> PAGEREF _Toc224925050 \h </w:instrText>
+          <w:instrText xml:space="preserve"> PAGEREF _Toc224925331 \h </w:instrText>
         </w:r>
         <w:r>
           <w:rPr>
@@ -3354,7 +3354,7 @@
           <w14:ligatures w14:val="standardContextual"/>
         </w:rPr>
       </w:pPr>
-      <w:hyperlink w:anchor="_Toc224925051" w:history="1">
+      <w:hyperlink w:anchor="_Toc224925332" w:history="1">
         <w:r>
           <w:rPr>
             <w:rStyle w:val="Lienhypertexte"/>
@@ -3381,7 +3381,7 @@
             <w:noProof/>
             <w:webHidden/>
           </w:rPr>
-          <w:instrText xml:space="preserve"> PAGEREF _Toc224925051 \h </w:instrText>
+          <w:instrText xml:space="preserve"> PAGEREF _Toc224925332 \h </w:instrText>
         </w:r>
         <w:r>
           <w:rPr>
@@ -3428,7 +3428,7 @@
           <w14:ligatures w14:val="standardContextual"/>
         </w:rPr>
       </w:pPr>
-      <w:hyperlink w:anchor="_Toc224925052" w:history="1">
+      <w:hyperlink w:anchor="_Toc224925333" w:history="1">
         <w:r>
           <w:rPr>
             <w:rStyle w:val="Lienhypertexte"/>
@@ -3455,7 +3455,7 @@
             <w:noProof/>
             <w:webHidden/>
           </w:rPr>
-          <w:instrText xml:space="preserve"> PAGEREF _Toc224925052 \h </w:instrText>
+          <w:instrText xml:space="preserve"> PAGEREF _Toc224925333 \h </w:instrText>
         </w:r>
         <w:r>
           <w:rPr>
@@ -3502,7 +3502,7 @@
           <w14:ligatures w14:val="standardContextual"/>
         </w:rPr>
       </w:pPr>
-      <w:hyperlink w:anchor="_Toc224925053" w:history="1">
+      <w:hyperlink w:anchor="_Toc224925334" w:history="1">
         <w:r>
           <w:rPr>
             <w:rStyle w:val="Lienhypertexte"/>
@@ -3529,7 +3529,7 @@
             <w:noProof/>
             <w:webHidden/>
           </w:rPr>
-          <w:instrText xml:space="preserve"> PAGEREF _Toc224925053 \h </w:instrText>
+          <w:instrText xml:space="preserve"> PAGEREF _Toc224925334 \h </w:instrText>
         </w:r>
         <w:r>
           <w:rPr>
@@ -3576,7 +3576,7 @@
           <w14:ligatures w14:val="standardContextual"/>
         </w:rPr>
       </w:pPr>
-      <w:hyperlink w:anchor="_Toc224925054" w:history="1">
+      <w:hyperlink w:anchor="_Toc224925335" w:history="1">
         <w:r>
           <w:rPr>
             <w:rStyle w:val="Lienhypertexte"/>
@@ -3603,7 +3603,7 @@
             <w:noProof/>
             <w:webHidden/>
           </w:rPr>
-          <w:instrText xml:space="preserve"> PAGEREF _Toc224925054 \h </w:instrText>
+          <w:instrText xml:space="preserve"> PAGEREF _Toc224925335 \h </w:instrText>
         </w:r>
         <w:r>
           <w:rPr>
@@ -3650,7 +3650,7 @@
           <w14:ligatures w14:val="standardContextual"/>
         </w:rPr>
       </w:pPr>
-      <w:hyperlink w:anchor="_Toc224925055" w:history="1">
+      <w:hyperlink w:anchor="_Toc224925336" w:history="1">
         <w:r>
           <w:rPr>
             <w:rStyle w:val="Lienhypertexte"/>
@@ -3677,7 +3677,7 @@
             <w:noProof/>
             <w:webHidden/>
           </w:rPr>
-          <w:instrText xml:space="preserve"> PAGEREF _Toc224925055 \h </w:instrText>
+          <w:instrText xml:space="preserve"> PAGEREF _Toc224925336 \h </w:instrText>
         </w:r>
         <w:r>
           <w:rPr>
@@ -3724,7 +3724,7 @@
           <w14:ligatures w14:val="standardContextual"/>
         </w:rPr>
       </w:pPr>
-      <w:hyperlink w:anchor="_Toc224925056" w:history="1">
+      <w:hyperlink w:anchor="_Toc224925337" w:history="1">
         <w:r>
           <w:rPr>
             <w:rStyle w:val="Lienhypertexte"/>
@@ -3751,7 +3751,7 @@
             <w:noProof/>
             <w:webHidden/>
           </w:rPr>
-          <w:instrText xml:space="preserve"> PAGEREF _Toc224925056 \h </w:instrText>
+          <w:instrText xml:space="preserve"> PAGEREF _Toc224925337 \h </w:instrText>
         </w:r>
         <w:r>
           <w:rPr>
@@ -3800,7 +3800,7 @@
           <w14:ligatures w14:val="standardContextual"/>
         </w:rPr>
       </w:pPr>
-      <w:hyperlink w:anchor="_Toc224925057" w:history="1">
+      <w:hyperlink w:anchor="_Toc224925338" w:history="1">
         <w:r>
           <w:rPr>
             <w:rStyle w:val="Lienhypertexte"/>
@@ -3828,7 +3828,7 @@
             <w:noProof/>
             <w:webHidden/>
           </w:rPr>
-          <w:instrText xml:space="preserve"> PAGEREF _Toc224925057 \h </w:instrText>
+          <w:instrText xml:space="preserve"> PAGEREF _Toc224925338 \h </w:instrText>
         </w:r>
         <w:r>
           <w:rPr>
@@ -3877,7 +3877,7 @@
           <w14:ligatures w14:val="standardContextual"/>
         </w:rPr>
       </w:pPr>
-      <w:hyperlink w:anchor="_Toc224925058" w:history="1">
+      <w:hyperlink w:anchor="_Toc224925339" w:history="1">
         <w:r>
           <w:rPr>
             <w:rStyle w:val="Lienhypertexte"/>
@@ -3904,7 +3904,7 @@
             <w:noProof/>
             <w:webHidden/>
           </w:rPr>
-          <w:instrText xml:space="preserve"> PAGEREF _Toc224925058 \h </w:instrText>
+          <w:instrText xml:space="preserve"> PAGEREF _Toc224925339 \h </w:instrText>
         </w:r>
         <w:r>
           <w:rPr>
@@ -3944,7 +3944,7 @@
       <w:pPr>
         <w:pStyle w:val="Titre1"/>
       </w:pPr>
-      <w:bookmarkStart w:id="0" w:name="_Toc224925008"/>
+      <w:bookmarkStart w:id="0" w:name="_Toc224925289"/>
       <w:r>
         <w:t>Prolégomènes</w:t>
       </w:r>
@@ -3954,7 +3954,7 @@
       <w:pPr>
         <w:pStyle w:val="Titre2"/>
       </w:pPr>
-      <w:bookmarkStart w:id="1" w:name="_Toc224925009"/>
+      <w:bookmarkStart w:id="1" w:name="_Toc224925290"/>
       <w:r>
         <w:t>Travailler avec un classeur Excel prenant en charge les macros</w:t>
       </w:r>
@@ -4140,7 +4140,7 @@
       <w:pPr>
         <w:pStyle w:val="Titre2"/>
       </w:pPr>
-      <w:bookmarkStart w:id="2" w:name="_Toc224925010"/>
+      <w:bookmarkStart w:id="2" w:name="_Toc224925291"/>
       <w:r>
         <w:lastRenderedPageBreak/>
         <w:t xml:space="preserve">Le </w:t>
@@ -4288,7 +4288,7 @@
       <w:pPr>
         <w:pStyle w:val="Titre2"/>
       </w:pPr>
-      <w:bookmarkStart w:id="3" w:name="_Toc224925011"/>
+      <w:bookmarkStart w:id="3" w:name="_Toc224925292"/>
       <w:r>
         <w:t xml:space="preserve">Code pour les </w:t>
       </w:r>
@@ -4384,7 +4384,7 @@
       <w:pPr>
         <w:pStyle w:val="Titre1"/>
       </w:pPr>
-      <w:bookmarkStart w:id="4" w:name="_Toc224925012"/>
+      <w:bookmarkStart w:id="4" w:name="_Toc224925293"/>
       <w:r>
         <w:t>Liste avec</w:t>
       </w:r>
@@ -4418,7 +4418,7 @@
       <w:pPr>
         <w:pStyle w:val="Titre2"/>
       </w:pPr>
-      <w:bookmarkStart w:id="5" w:name="_Toc224925013"/>
+      <w:bookmarkStart w:id="5" w:name="_Toc224925294"/>
       <w:r>
         <w:t xml:space="preserve">Avec </w:t>
       </w:r>
@@ -4974,7 +4974,7 @@
       <w:pPr>
         <w:pStyle w:val="Titre3"/>
       </w:pPr>
-      <w:bookmarkStart w:id="6" w:name="_Toc224925014"/>
+      <w:bookmarkStart w:id="6" w:name="_Toc224925295"/>
       <w:r>
         <w:t>Syntaxe de la fonction REMPLACER</w:t>
       </w:r>
@@ -5359,7 +5359,7 @@
       <w:pPr>
         <w:pStyle w:val="Titre3"/>
       </w:pPr>
-      <w:bookmarkStart w:id="7" w:name="_Toc224925015"/>
+      <w:bookmarkStart w:id="7" w:name="_Toc224925296"/>
       <w:r>
         <w:t>Syntaxe de la fonction TROUVE</w:t>
       </w:r>
@@ -5728,7 +5728,7 @@
       <w:pPr>
         <w:pStyle w:val="Titre3"/>
       </w:pPr>
-      <w:bookmarkStart w:id="8" w:name="_Toc224925016"/>
+      <w:bookmarkStart w:id="8" w:name="_Toc224925297"/>
       <w:r>
         <w:t>Explications :</w:t>
       </w:r>
@@ -5927,7 +5927,7 @@
       <w:pPr>
         <w:pStyle w:val="Titre3"/>
       </w:pPr>
-      <w:bookmarkStart w:id="9" w:name="_Toc224925017"/>
+      <w:bookmarkStart w:id="9" w:name="_Toc224925298"/>
       <w:r>
         <w:t>Syntaxe</w:t>
       </w:r>
@@ -5991,7 +5991,7 @@
       <w:pPr>
         <w:pStyle w:val="Titre4"/>
       </w:pPr>
-      <w:bookmarkStart w:id="10" w:name="_Toc224925018"/>
+      <w:bookmarkStart w:id="10" w:name="_Toc224925299"/>
       <w:r>
         <w:t>Syntaxe de la fonction INDEX</w:t>
       </w:r>
@@ -6543,7 +6543,7 @@
       <w:pPr>
         <w:pStyle w:val="Titre4"/>
       </w:pPr>
-      <w:bookmarkStart w:id="11" w:name="_Toc224925019"/>
+      <w:bookmarkStart w:id="11" w:name="_Toc224925300"/>
       <w:r>
         <w:t>Syntaxe de la fonction INDEX</w:t>
       </w:r>
@@ -7210,7 +7210,7 @@
       <w:pPr>
         <w:pStyle w:val="Titre2"/>
       </w:pPr>
-      <w:bookmarkStart w:id="12" w:name="_Toc224925020"/>
+      <w:bookmarkStart w:id="12" w:name="_Toc224925301"/>
       <w:r>
         <w:t>Avec LIRE.CLASSEUR , TRANSPOSE et SUBSTITUE</w:t>
       </w:r>
@@ -7836,7 +7836,7 @@
       <w:pPr>
         <w:pStyle w:val="Titre3"/>
       </w:pPr>
-      <w:bookmarkStart w:id="13" w:name="_Toc224925021"/>
+      <w:bookmarkStart w:id="13" w:name="_Toc224925302"/>
       <w:r>
         <w:t>Syntaxe de la fonction SUBSTITUE</w:t>
       </w:r>
@@ -8297,7 +8297,7 @@
       <w:pPr>
         <w:pStyle w:val="Titre3"/>
       </w:pPr>
-      <w:bookmarkStart w:id="14" w:name="_Toc224925022"/>
+      <w:bookmarkStart w:id="14" w:name="_Toc224925303"/>
       <w:r>
         <w:t>Syntaxe de la fonction TRANSPOSE</w:t>
       </w:r>
@@ -8746,7 +8746,7 @@
       <w:pPr>
         <w:pStyle w:val="Titre3"/>
       </w:pPr>
-      <w:bookmarkStart w:id="15" w:name="_Toc224925023"/>
+      <w:bookmarkStart w:id="15" w:name="_Toc224925304"/>
       <w:r>
         <w:t>Explications :</w:t>
       </w:r>
@@ -8986,7 +8986,7 @@
       <w:pPr>
         <w:pStyle w:val="Titre2"/>
       </w:pPr>
-      <w:bookmarkStart w:id="16" w:name="_Toc224925024"/>
+      <w:bookmarkStart w:id="16" w:name="_Toc224925305"/>
       <w:r>
         <w:t>Avec LIRE.CLASSEUR, REMPLACER, TROUVE et TRANSPOSE</w:t>
       </w:r>
@@ -9001,7 +9001,7 @@
       <w:pPr>
         <w:pStyle w:val="Titre3"/>
       </w:pPr>
-      <w:bookmarkStart w:id="17" w:name="_Toc224925025"/>
+      <w:bookmarkStart w:id="17" w:name="_Toc224925306"/>
       <w:r>
         <w:t>Étape 1 : Clique</w:t>
       </w:r>
@@ -9142,7 +9142,7 @@
       <w:pPr>
         <w:pStyle w:val="Titre3"/>
       </w:pPr>
-      <w:bookmarkStart w:id="18" w:name="_Toc224925026"/>
+      <w:bookmarkStart w:id="18" w:name="_Toc224925307"/>
       <w:r>
         <w:t>Étape 2 : Modifiez le nom et la formule dans la boîte de dialogue Nouveau nom</w:t>
       </w:r>
@@ -9573,7 +9573,7 @@
       <w:pPr>
         <w:pStyle w:val="Titre3"/>
       </w:pPr>
-      <w:bookmarkStart w:id="19" w:name="_Toc224925027"/>
+      <w:bookmarkStart w:id="19" w:name="_Toc224925308"/>
       <w:r>
         <w:t>Étape 3 : Utilisation d'une formule pour lister les noms des feuilles</w:t>
       </w:r>
@@ -9727,7 +9727,7 @@
       <w:pPr>
         <w:pStyle w:val="Titre2"/>
       </w:pPr>
-      <w:bookmarkStart w:id="20" w:name="_Toc224925028"/>
+      <w:bookmarkStart w:id="20" w:name="_Toc224925309"/>
       <w:r>
         <w:t xml:space="preserve">Avec LIRE.CLASSEUR, </w:t>
       </w:r>
@@ -9902,7 +9902,7 @@
       <w:pPr>
         <w:pStyle w:val="Titre3"/>
       </w:pPr>
-      <w:bookmarkStart w:id="21" w:name="_Toc224925029"/>
+      <w:bookmarkStart w:id="21" w:name="_Toc224925310"/>
       <w:r>
         <w:t>Étape 1 : Clique</w:t>
       </w:r>
@@ -9991,7 +9991,7 @@
       <w:pPr>
         <w:pStyle w:val="Titre3"/>
       </w:pPr>
-      <w:bookmarkStart w:id="22" w:name="_Toc224925030"/>
+      <w:bookmarkStart w:id="22" w:name="_Toc224925311"/>
       <w:r>
         <w:t xml:space="preserve">Étape </w:t>
       </w:r>
@@ -10107,7 +10107,7 @@
       <w:pPr>
         <w:pStyle w:val="Titre3"/>
       </w:pPr>
-      <w:bookmarkStart w:id="23" w:name="_Toc224925031"/>
+      <w:bookmarkStart w:id="23" w:name="_Toc224925312"/>
       <w:r>
         <w:t xml:space="preserve">Étape </w:t>
       </w:r>
@@ -10395,7 +10395,7 @@
       <w:pPr>
         <w:pStyle w:val="Titre3"/>
       </w:pPr>
-      <w:bookmarkStart w:id="24" w:name="_Toc224925032"/>
+      <w:bookmarkStart w:id="24" w:name="_Toc224925313"/>
       <w:r>
         <w:t xml:space="preserve">Étape </w:t>
       </w:r>
@@ -10514,7 +10514,7 @@
       <w:pPr>
         <w:pStyle w:val="Titre4"/>
       </w:pPr>
-      <w:bookmarkStart w:id="25" w:name="_Toc224925033"/>
+      <w:bookmarkStart w:id="25" w:name="_Toc224925314"/>
       <w:r>
         <w:t>Syntaxe de</w:t>
       </w:r>
@@ -10951,7 +10951,7 @@
       <w:pPr>
         <w:pStyle w:val="Titre4"/>
       </w:pPr>
-      <w:bookmarkStart w:id="26" w:name="_Toc224925034"/>
+      <w:bookmarkStart w:id="26" w:name="_Toc224925315"/>
       <w:r>
         <w:t>Explications</w:t>
       </w:r>
@@ -10961,7 +10961,7 @@
       <w:pPr>
         <w:pStyle w:val="Titre4"/>
       </w:pPr>
-      <w:bookmarkStart w:id="27" w:name="_Toc224925035"/>
+      <w:bookmarkStart w:id="27" w:name="_Toc224925316"/>
       <w:r>
         <w:t>Décomposer le résultat de LIRE.CLASSEUR()</w:t>
       </w:r>
@@ -11795,7 +11795,7 @@
       <w:pPr>
         <w:pStyle w:val="Titre4"/>
       </w:pPr>
-      <w:bookmarkStart w:id="28" w:name="_Toc224925036"/>
+      <w:bookmarkStart w:id="28" w:name="_Toc224925317"/>
       <w:r>
         <w:t>Autre solution avec la fonction DROITE()</w:t>
       </w:r>
@@ -12074,7 +12074,7 @@
       <w:pPr>
         <w:pStyle w:val="Titre3"/>
       </w:pPr>
-      <w:bookmarkStart w:id="29" w:name="_Toc224925037"/>
+      <w:bookmarkStart w:id="29" w:name="_Toc224925318"/>
       <w:r>
         <w:t xml:space="preserve">Étape </w:t>
       </w:r>
@@ -12566,7 +12566,7 @@
       <w:pPr>
         <w:pStyle w:val="Titre3"/>
       </w:pPr>
-      <w:bookmarkStart w:id="30" w:name="_Toc224925038"/>
+      <w:bookmarkStart w:id="30" w:name="_Toc224925319"/>
       <w:r>
         <w:lastRenderedPageBreak/>
         <w:t>Étape 6 : Gérer les erreurs #REF ! avec la fonction SIERREUR</w:t>
@@ -12649,7 +12649,7 @@
       <w:pPr>
         <w:pStyle w:val="Titre4"/>
       </w:pPr>
-      <w:bookmarkStart w:id="31" w:name="_Toc224925039"/>
+      <w:bookmarkStart w:id="31" w:name="_Toc224925320"/>
       <w:r>
         <w:t>Syntaxe de la fonction SIERREUR</w:t>
       </w:r>
@@ -13253,7 +13253,7 @@
       <w:pPr>
         <w:pStyle w:val="Titre4"/>
       </w:pPr>
-      <w:bookmarkStart w:id="32" w:name="_Toc224925040"/>
+      <w:bookmarkStart w:id="32" w:name="_Toc224925321"/>
       <w:r>
         <w:t>Modification de la formule pour ne pas compter la feuille Sommaire</w:t>
       </w:r>
@@ -13423,7 +13423,7 @@
       <w:pPr>
         <w:pStyle w:val="Titre2"/>
       </w:pPr>
-      <w:bookmarkStart w:id="33" w:name="_Toc224925041"/>
+      <w:bookmarkStart w:id="33" w:name="_Toc224925322"/>
       <w:r>
         <w:t>Pour aller plus loin</w:t>
       </w:r>
@@ -13433,7 +13433,7 @@
       <w:pPr>
         <w:pStyle w:val="Titre3"/>
       </w:pPr>
-      <w:bookmarkStart w:id="34" w:name="_Toc224925042"/>
+      <w:bookmarkStart w:id="34" w:name="_Toc224925323"/>
       <w:r>
         <w:t>Rendre l'affichage</w:t>
       </w:r>
@@ -13613,7 +13613,7 @@
       <w:pPr>
         <w:pStyle w:val="Titre4"/>
       </w:pPr>
-      <w:bookmarkStart w:id="35" w:name="_Toc224925043"/>
+      <w:bookmarkStart w:id="35" w:name="_Toc224925324"/>
       <w:r>
         <w:t>Avec ALEA et TEXTE</w:t>
       </w:r>
@@ -13649,7 +13649,7 @@
       <w:pPr>
         <w:pStyle w:val="Titre5"/>
       </w:pPr>
-      <w:bookmarkStart w:id="36" w:name="_Toc224925044"/>
+      <w:bookmarkStart w:id="36" w:name="_Toc224925325"/>
       <w:r>
         <w:t xml:space="preserve">Syntaxe de la fonction </w:t>
       </w:r>
@@ -13821,7 +13821,7 @@
       <w:pPr>
         <w:pStyle w:val="Titre5"/>
       </w:pPr>
-      <w:bookmarkStart w:id="37" w:name="_Toc224925045"/>
+      <w:bookmarkStart w:id="37" w:name="_Toc224925326"/>
       <w:r>
         <w:t>Syntaxe de la fonction TEXTE</w:t>
       </w:r>
@@ -14515,7 +14515,7 @@
       <w:pPr>
         <w:pStyle w:val="Titre4"/>
       </w:pPr>
-      <w:bookmarkStart w:id="38" w:name="_Toc224925046"/>
+      <w:bookmarkStart w:id="38" w:name="_Toc224925327"/>
       <w:r>
         <w:t>Avec</w:t>
       </w:r>
@@ -14536,7 +14536,7 @@
       <w:pPr>
         <w:pStyle w:val="Titre5"/>
       </w:pPr>
-      <w:bookmarkStart w:id="39" w:name="_Toc224925047"/>
+      <w:bookmarkStart w:id="39" w:name="_Toc224925328"/>
       <w:r>
         <w:t xml:space="preserve">Syntaxe de la fonction </w:t>
       </w:r>
@@ -14855,7 +14855,7 @@
       <w:pPr>
         <w:pStyle w:val="Titre5"/>
       </w:pPr>
-      <w:bookmarkStart w:id="40" w:name="_Toc224925048"/>
+      <w:bookmarkStart w:id="40" w:name="_Toc224925329"/>
       <w:r>
         <w:t>Syntaxe de la fonction T</w:t>
       </w:r>
@@ -15406,7 +15406,7 @@
       <w:pPr>
         <w:pStyle w:val="Titre3"/>
       </w:pPr>
-      <w:bookmarkStart w:id="41" w:name="_Toc224925049"/>
+      <w:bookmarkStart w:id="41" w:name="_Toc224925330"/>
       <w:r>
         <w:t>On peut ajouter des liens hypertexte sur le nom des feuilles.</w:t>
       </w:r>
@@ -15421,7 +15421,7 @@
       <w:pPr>
         <w:pStyle w:val="Titre4"/>
       </w:pPr>
-      <w:bookmarkStart w:id="42" w:name="_Toc224925050"/>
+      <w:bookmarkStart w:id="42" w:name="_Toc224925331"/>
       <w:r>
         <w:t>Ajouter des liens hypertexte manuellement</w:t>
       </w:r>
@@ -15472,7 +15472,7 @@
       <w:pPr>
         <w:pStyle w:val="Titre5"/>
       </w:pPr>
-      <w:bookmarkStart w:id="43" w:name="_Toc224925051"/>
+      <w:bookmarkStart w:id="43" w:name="_Toc224925332"/>
       <w:r>
         <w:lastRenderedPageBreak/>
         <w:t>Insérer des liens hypertextes sur les noms figurant dans le sommaire</w:t>
@@ -15970,7 +15970,7 @@
       <w:pPr>
         <w:pStyle w:val="Titre5"/>
       </w:pPr>
-      <w:bookmarkStart w:id="44" w:name="_Toc224925052"/>
+      <w:bookmarkStart w:id="44" w:name="_Toc224925333"/>
       <w:r>
         <w:t xml:space="preserve">Insérer une icône et </w:t>
       </w:r>
@@ -16862,7 +16862,7 @@
       <w:pPr>
         <w:pStyle w:val="Titre4"/>
       </w:pPr>
-      <w:bookmarkStart w:id="45" w:name="_Toc224925053"/>
+      <w:bookmarkStart w:id="45" w:name="_Toc224925334"/>
       <w:r>
         <w:t>Transition vers le VBA : ajouter des liens hypertexte par code</w:t>
       </w:r>
@@ -16908,7 +16908,7 @@
       <w:pPr>
         <w:pStyle w:val="Titre5"/>
       </w:pPr>
-      <w:bookmarkStart w:id="46" w:name="_Toc224925054"/>
+      <w:bookmarkStart w:id="46" w:name="_Toc224925335"/>
       <w:r>
         <w:t>Syntaxe VBA pour un hyperlien</w:t>
       </w:r>
@@ -17618,7 +17618,7 @@
       <w:pPr>
         <w:pStyle w:val="Titre5"/>
       </w:pPr>
-      <w:bookmarkStart w:id="47" w:name="_Toc224925055"/>
+      <w:bookmarkStart w:id="47" w:name="_Toc224925336"/>
       <w:r>
         <w:t>Ajouter un index hyperlien des feuilles dans le classeur</w:t>
       </w:r>
@@ -19907,7 +19907,7 @@
       <w:pPr>
         <w:pStyle w:val="Titre5"/>
       </w:pPr>
-      <w:bookmarkStart w:id="48" w:name="_Toc224925056"/>
+      <w:bookmarkStart w:id="48" w:name="_Toc224925337"/>
       <w:r>
         <w:t>Le principe DRY</w:t>
       </w:r>
@@ -20150,7 +20150,7 @@
           <w:highlight w:val="yellow"/>
         </w:rPr>
       </w:pPr>
-      <w:bookmarkStart w:id="49" w:name="_Toc224925057"/>
+      <w:bookmarkStart w:id="49" w:name="_Toc224925338"/>
       <w:r>
         <w:rPr>
           <w:b/>
@@ -20185,13 +20185,14 @@
         <w:tblLook w:val="04A0" w:firstRow="1" w:lastRow="0" w:firstColumn="1" w:lastColumn="0" w:noHBand="0" w:noVBand="1"/>
       </w:tblPr>
       <w:tblGrid>
-        <w:gridCol w:w="4531"/>
-        <w:gridCol w:w="4531"/>
+        <w:gridCol w:w="1462"/>
+        <w:gridCol w:w="919"/>
+        <w:gridCol w:w="3762"/>
       </w:tblGrid>
       <w:tr>
         <w:tc>
           <w:tcPr>
-            <w:tcW w:w="4531" w:type="dxa"/>
+            <w:tcW w:w="0" w:type="auto"/>
           </w:tcPr>
           <w:p>
             <w:pPr>
@@ -20215,7 +20216,7 @@
         </w:tc>
         <w:tc>
           <w:tcPr>
-            <w:tcW w:w="4531" w:type="dxa"/>
+            <w:tcW w:w="0" w:type="auto"/>
           </w:tcPr>
           <w:p>
             <w:pPr>
@@ -20237,11 +20238,35 @@
             </w:r>
           </w:p>
         </w:tc>
+        <w:tc>
+          <w:tcPr>
+            <w:tcW w:w="0" w:type="auto"/>
+          </w:tcPr>
+          <w:p>
+            <w:pPr>
+              <w:rPr>
+                <w:b/>
+                <w:bCs/>
+                <w:sz w:val="24"/>
+                <w:szCs w:val="24"/>
+              </w:rPr>
+            </w:pPr>
+            <w:r>
+              <w:rPr>
+                <w:b/>
+                <w:bCs/>
+                <w:sz w:val="24"/>
+                <w:szCs w:val="24"/>
+              </w:rPr>
+              <w:t>Syntaxe</w:t>
+            </w:r>
+          </w:p>
+        </w:tc>
       </w:tr>
       <w:tr>
         <w:tc>
           <w:tcPr>
-            <w:tcW w:w="4531" w:type="dxa"/>
+            <w:tcW w:w="0" w:type="auto"/>
           </w:tcPr>
           <w:p>
             <w:pPr>
@@ -20261,7 +20286,7 @@
         </w:tc>
         <w:tc>
           <w:tcPr>
-            <w:tcW w:w="4531" w:type="dxa"/>
+            <w:tcW w:w="0" w:type="auto"/>
           </w:tcPr>
           <w:p>
             <w:r>
@@ -20269,11 +20294,21 @@
             </w:r>
           </w:p>
         </w:tc>
+        <w:tc>
+          <w:tcPr>
+            <w:tcW w:w="0" w:type="auto"/>
+          </w:tcPr>
+          <w:p>
+            <w:r>
+              <w:t>RAND()</w:t>
+            </w:r>
+          </w:p>
+        </w:tc>
       </w:tr>
       <w:tr>
         <w:tc>
           <w:tcPr>
-            <w:tcW w:w="4531" w:type="dxa"/>
+            <w:tcW w:w="0" w:type="auto"/>
           </w:tcPr>
           <w:p>
             <w:r>
@@ -20283,7 +20318,7 @@
         </w:tc>
         <w:tc>
           <w:tcPr>
-            <w:tcW w:w="4531" w:type="dxa"/>
+            <w:tcW w:w="0" w:type="auto"/>
           </w:tcPr>
           <w:p>
             <w:r>
@@ -20291,11 +20326,57 @@
             </w:r>
           </w:p>
         </w:tc>
+        <w:tc>
+          <w:tcPr>
+            <w:tcW w:w="0" w:type="auto"/>
+          </w:tcPr>
+          <w:p>
+            <w:pPr>
+              <w:rPr>
+                <w:lang w:val="en-US"/>
+              </w:rPr>
+            </w:pPr>
+            <w:r>
+              <w:rPr>
+                <w:lang w:val="en-US"/>
+              </w:rPr>
+              <w:t xml:space="preserve">INDEX(array, </w:t>
+            </w:r>
+            <w:proofErr w:type="spellStart"/>
+            <w:r>
+              <w:rPr>
+                <w:lang w:val="en-US"/>
+              </w:rPr>
+              <w:t>row_num</w:t>
+            </w:r>
+            <w:proofErr w:type="spellEnd"/>
+            <w:r>
+              <w:rPr>
+                <w:lang w:val="en-US"/>
+              </w:rPr>
+              <w:t>, [</w:t>
+            </w:r>
+            <w:proofErr w:type="spellStart"/>
+            <w:r>
+              <w:rPr>
+                <w:lang w:val="en-US"/>
+              </w:rPr>
+              <w:t>column_num</w:t>
+            </w:r>
+            <w:proofErr w:type="spellEnd"/>
+            <w:r>
+              <w:rPr>
+                <w:lang w:val="en-US"/>
+              </w:rPr>
+              <w:t>])</w:t>
+            </w:r>
+          </w:p>
+        </w:tc>
       </w:tr>
       <w:tr>
         <w:tc>
           <w:tcPr>
-            <w:tcW w:w="4531" w:type="dxa"/>
+            <w:tcW w:w="0" w:type="auto"/>
           </w:tcPr>
           <w:p>
             <w:r>
@@ -20306,7 +20387,13 @@
         </w:tc>
         <w:tc>
           <w:tcPr>
-            <w:tcW w:w="4531" w:type="dxa"/>
+            <w:tcW w:w="0" w:type="auto"/>
+          </w:tcPr>
+          <w:p/>
+        </w:tc>
+        <w:tc>
+          <w:tcPr>
+            <w:tcW w:w="0" w:type="auto"/>
           </w:tcPr>
           <w:p/>
         </w:tc>
@@ -20314,7 +20401,7 @@
       <w:tr>
         <w:tc>
           <w:tcPr>
-            <w:tcW w:w="4531" w:type="dxa"/>
+            <w:tcW w:w="0" w:type="auto"/>
           </w:tcPr>
           <w:p>
             <w:r>
@@ -20324,7 +20411,13 @@
         </w:tc>
         <w:tc>
           <w:tcPr>
-            <w:tcW w:w="4531" w:type="dxa"/>
+            <w:tcW w:w="0" w:type="auto"/>
+          </w:tcPr>
+          <w:p/>
+        </w:tc>
+        <w:tc>
+          <w:tcPr>
+            <w:tcW w:w="0" w:type="auto"/>
           </w:tcPr>
           <w:p/>
         </w:tc>
@@ -20332,7 +20425,7 @@
       <w:tr>
         <w:tc>
           <w:tcPr>
-            <w:tcW w:w="4531" w:type="dxa"/>
+            <w:tcW w:w="0" w:type="auto"/>
           </w:tcPr>
           <w:p>
             <w:r>
@@ -20342,7 +20435,13 @@
         </w:tc>
         <w:tc>
           <w:tcPr>
-            <w:tcW w:w="4531" w:type="dxa"/>
+            <w:tcW w:w="0" w:type="auto"/>
+          </w:tcPr>
+          <w:p/>
+        </w:tc>
+        <w:tc>
+          <w:tcPr>
+            <w:tcW w:w="0" w:type="auto"/>
           </w:tcPr>
           <w:p/>
         </w:tc>
@@ -20350,7 +20449,7 @@
       <w:tr>
         <w:tc>
           <w:tcPr>
-            <w:tcW w:w="4531" w:type="dxa"/>
+            <w:tcW w:w="0" w:type="auto"/>
           </w:tcPr>
           <w:p>
             <w:r>
@@ -20360,7 +20459,13 @@
         </w:tc>
         <w:tc>
           <w:tcPr>
-            <w:tcW w:w="4531" w:type="dxa"/>
+            <w:tcW w:w="0" w:type="auto"/>
+          </w:tcPr>
+          <w:p/>
+        </w:tc>
+        <w:tc>
+          <w:tcPr>
+            <w:tcW w:w="0" w:type="auto"/>
           </w:tcPr>
           <w:p/>
         </w:tc>
@@ -20368,7 +20473,7 @@
       <w:tr>
         <w:tc>
           <w:tcPr>
-            <w:tcW w:w="4531" w:type="dxa"/>
+            <w:tcW w:w="0" w:type="auto"/>
           </w:tcPr>
           <w:p>
             <w:r>
@@ -20378,7 +20483,13 @@
         </w:tc>
         <w:tc>
           <w:tcPr>
-            <w:tcW w:w="4531" w:type="dxa"/>
+            <w:tcW w:w="0" w:type="auto"/>
+          </w:tcPr>
+          <w:p/>
+        </w:tc>
+        <w:tc>
+          <w:tcPr>
+            <w:tcW w:w="0" w:type="auto"/>
           </w:tcPr>
           <w:p/>
         </w:tc>
@@ -20386,7 +20497,7 @@
       <w:tr>
         <w:tc>
           <w:tcPr>
-            <w:tcW w:w="4531" w:type="dxa"/>
+            <w:tcW w:w="0" w:type="auto"/>
           </w:tcPr>
           <w:p>
             <w:r>
@@ -20396,7 +20507,13 @@
         </w:tc>
         <w:tc>
           <w:tcPr>
-            <w:tcW w:w="4531" w:type="dxa"/>
+            <w:tcW w:w="0" w:type="auto"/>
+          </w:tcPr>
+          <w:p/>
+        </w:tc>
+        <w:tc>
+          <w:tcPr>
+            <w:tcW w:w="0" w:type="auto"/>
           </w:tcPr>
           <w:p/>
         </w:tc>
@@ -20404,7 +20521,7 @@
       <w:tr>
         <w:tc>
           <w:tcPr>
-            <w:tcW w:w="4531" w:type="dxa"/>
+            <w:tcW w:w="0" w:type="auto"/>
           </w:tcPr>
           <w:p>
             <w:r>
@@ -20414,7 +20531,13 @@
         </w:tc>
         <w:tc>
           <w:tcPr>
-            <w:tcW w:w="4531" w:type="dxa"/>
+            <w:tcW w:w="0" w:type="auto"/>
+          </w:tcPr>
+          <w:p/>
+        </w:tc>
+        <w:tc>
+          <w:tcPr>
+            <w:tcW w:w="0" w:type="auto"/>
           </w:tcPr>
           <w:p/>
         </w:tc>
@@ -20422,7 +20545,7 @@
       <w:tr>
         <w:tc>
           <w:tcPr>
-            <w:tcW w:w="4531" w:type="dxa"/>
+            <w:tcW w:w="0" w:type="auto"/>
           </w:tcPr>
           <w:p>
             <w:r>
@@ -20432,7 +20555,7 @@
         </w:tc>
         <w:tc>
           <w:tcPr>
-            <w:tcW w:w="4531" w:type="dxa"/>
+            <w:tcW w:w="0" w:type="auto"/>
           </w:tcPr>
           <w:p>
             <w:r>
@@ -20440,6 +20563,12 @@
             </w:r>
           </w:p>
         </w:tc>
+        <w:tc>
+          <w:tcPr>
+            <w:tcW w:w="0" w:type="auto"/>
+          </w:tcPr>
+          <w:p/>
+        </w:tc>
       </w:tr>
     </w:tbl>
     <w:p/>
@@ -20448,7 +20577,7 @@
         <w:pStyle w:val="Titre1"/>
       </w:pPr>
       <w:bookmarkStart w:id="50" w:name="_Toc223707034"/>
-      <w:bookmarkStart w:id="51" w:name="_Toc224925058"/>
+      <w:bookmarkStart w:id="51" w:name="_Toc224925339"/>
       <w:r>
         <w:t>Links</w:t>
       </w:r>
@@ -21441,7 +21570,7 @@
               <w:sz w:val="16"/>
               <w:szCs w:val="16"/>
             </w:rPr>
-            <w:t>19-03-2026 18:15</w:t>
+            <w:t>20-03-2026 18:49</w:t>
           </w:r>
           <w:r>
             <w:rPr>

</xml_diff>

<commit_message>
03/20 Aid DataTableDesignTsp+VBE+Admin+FunXL 3
</commit_message>
<xml_diff>
--- a/EXCEL_CodeSource/Classeurs_CodeSource/SheetsList/Lister le nom des feuilles dans Excel.docx
+++ b/EXCEL_CodeSource/Classeurs_CodeSource/SheetsList/Lister le nom des feuilles dans Excel.docx
@@ -152,7 +152,7 @@
       <w:r>
         <w:fldChar w:fldCharType="separate"/>
       </w:r>
-      <w:hyperlink w:anchor="_Toc224925289" w:history="1">
+      <w:hyperlink w:anchor="_Toc224925598" w:history="1">
         <w:r>
           <w:rPr>
             <w:rStyle w:val="Lienhypertexte"/>
@@ -179,7 +179,7 @@
             <w:noProof/>
             <w:webHidden/>
           </w:rPr>
-          <w:instrText xml:space="preserve"> PAGEREF _Toc224925289 \h </w:instrText>
+          <w:instrText xml:space="preserve"> PAGEREF _Toc224925598 \h </w:instrText>
         </w:r>
         <w:r>
           <w:rPr>
@@ -226,7 +226,7 @@
           <w14:ligatures w14:val="standardContextual"/>
         </w:rPr>
       </w:pPr>
-      <w:hyperlink w:anchor="_Toc224925290" w:history="1">
+      <w:hyperlink w:anchor="_Toc224925599" w:history="1">
         <w:r>
           <w:rPr>
             <w:rStyle w:val="Lienhypertexte"/>
@@ -253,7 +253,7 @@
             <w:noProof/>
             <w:webHidden/>
           </w:rPr>
-          <w:instrText xml:space="preserve"> PAGEREF _Toc224925290 \h </w:instrText>
+          <w:instrText xml:space="preserve"> PAGEREF _Toc224925599 \h </w:instrText>
         </w:r>
         <w:r>
           <w:rPr>
@@ -300,7 +300,7 @@
           <w14:ligatures w14:val="standardContextual"/>
         </w:rPr>
       </w:pPr>
-      <w:hyperlink w:anchor="_Toc224925291" w:history="1">
+      <w:hyperlink w:anchor="_Toc224925600" w:history="1">
         <w:r>
           <w:rPr>
             <w:rStyle w:val="Lienhypertexte"/>
@@ -327,7 +327,7 @@
             <w:noProof/>
             <w:webHidden/>
           </w:rPr>
-          <w:instrText xml:space="preserve"> PAGEREF _Toc224925291 \h </w:instrText>
+          <w:instrText xml:space="preserve"> PAGEREF _Toc224925600 \h </w:instrText>
         </w:r>
         <w:r>
           <w:rPr>
@@ -374,7 +374,7 @@
           <w14:ligatures w14:val="standardContextual"/>
         </w:rPr>
       </w:pPr>
-      <w:hyperlink w:anchor="_Toc224925292" w:history="1">
+      <w:hyperlink w:anchor="_Toc224925601" w:history="1">
         <w:r>
           <w:rPr>
             <w:rStyle w:val="Lienhypertexte"/>
@@ -401,7 +401,7 @@
             <w:noProof/>
             <w:webHidden/>
           </w:rPr>
-          <w:instrText xml:space="preserve"> PAGEREF _Toc224925292 \h </w:instrText>
+          <w:instrText xml:space="preserve"> PAGEREF _Toc224925601 \h </w:instrText>
         </w:r>
         <w:r>
           <w:rPr>
@@ -450,7 +450,7 @@
           <w14:ligatures w14:val="standardContextual"/>
         </w:rPr>
       </w:pPr>
-      <w:hyperlink w:anchor="_Toc224925293" w:history="1">
+      <w:hyperlink w:anchor="_Toc224925602" w:history="1">
         <w:r>
           <w:rPr>
             <w:rStyle w:val="Lienhypertexte"/>
@@ -477,7 +477,7 @@
             <w:noProof/>
             <w:webHidden/>
           </w:rPr>
-          <w:instrText xml:space="preserve"> PAGEREF _Toc224925293 \h </w:instrText>
+          <w:instrText xml:space="preserve"> PAGEREF _Toc224925602 \h </w:instrText>
         </w:r>
         <w:r>
           <w:rPr>
@@ -524,7 +524,7 @@
           <w14:ligatures w14:val="standardContextual"/>
         </w:rPr>
       </w:pPr>
-      <w:hyperlink w:anchor="_Toc224925294" w:history="1">
+      <w:hyperlink w:anchor="_Toc224925603" w:history="1">
         <w:r>
           <w:rPr>
             <w:rStyle w:val="Lienhypertexte"/>
@@ -551,7 +551,7 @@
             <w:noProof/>
             <w:webHidden/>
           </w:rPr>
-          <w:instrText xml:space="preserve"> PAGEREF _Toc224925294 \h </w:instrText>
+          <w:instrText xml:space="preserve"> PAGEREF _Toc224925603 \h </w:instrText>
         </w:r>
         <w:r>
           <w:rPr>
@@ -599,7 +599,7 @@
           <w14:ligatures w14:val="standardContextual"/>
         </w:rPr>
       </w:pPr>
-      <w:hyperlink w:anchor="_Toc224925295" w:history="1">
+      <w:hyperlink w:anchor="_Toc224925604" w:history="1">
         <w:r>
           <w:rPr>
             <w:rStyle w:val="Lienhypertexte"/>
@@ -626,7 +626,7 @@
             <w:noProof/>
             <w:webHidden/>
           </w:rPr>
-          <w:instrText xml:space="preserve"> PAGEREF _Toc224925295 \h </w:instrText>
+          <w:instrText xml:space="preserve"> PAGEREF _Toc224925604 \h </w:instrText>
         </w:r>
         <w:r>
           <w:rPr>
@@ -674,7 +674,7 @@
           <w14:ligatures w14:val="standardContextual"/>
         </w:rPr>
       </w:pPr>
-      <w:hyperlink w:anchor="_Toc224925296" w:history="1">
+      <w:hyperlink w:anchor="_Toc224925605" w:history="1">
         <w:r>
           <w:rPr>
             <w:rStyle w:val="Lienhypertexte"/>
@@ -701,7 +701,7 @@
             <w:noProof/>
             <w:webHidden/>
           </w:rPr>
-          <w:instrText xml:space="preserve"> PAGEREF _Toc224925296 \h </w:instrText>
+          <w:instrText xml:space="preserve"> PAGEREF _Toc224925605 \h </w:instrText>
         </w:r>
         <w:r>
           <w:rPr>
@@ -749,7 +749,7 @@
           <w14:ligatures w14:val="standardContextual"/>
         </w:rPr>
       </w:pPr>
-      <w:hyperlink w:anchor="_Toc224925297" w:history="1">
+      <w:hyperlink w:anchor="_Toc224925606" w:history="1">
         <w:r>
           <w:rPr>
             <w:rStyle w:val="Lienhypertexte"/>
@@ -776,7 +776,7 @@
             <w:noProof/>
             <w:webHidden/>
           </w:rPr>
-          <w:instrText xml:space="preserve"> PAGEREF _Toc224925297 \h </w:instrText>
+          <w:instrText xml:space="preserve"> PAGEREF _Toc224925606 \h </w:instrText>
         </w:r>
         <w:r>
           <w:rPr>
@@ -824,7 +824,7 @@
           <w14:ligatures w14:val="standardContextual"/>
         </w:rPr>
       </w:pPr>
-      <w:hyperlink w:anchor="_Toc224925298" w:history="1">
+      <w:hyperlink w:anchor="_Toc224925607" w:history="1">
         <w:r>
           <w:rPr>
             <w:rStyle w:val="Lienhypertexte"/>
@@ -851,7 +851,7 @@
             <w:noProof/>
             <w:webHidden/>
           </w:rPr>
-          <w:instrText xml:space="preserve"> PAGEREF _Toc224925298 \h </w:instrText>
+          <w:instrText xml:space="preserve"> PAGEREF _Toc224925607 \h </w:instrText>
         </w:r>
         <w:r>
           <w:rPr>
@@ -898,7 +898,7 @@
           <w14:ligatures w14:val="standardContextual"/>
         </w:rPr>
       </w:pPr>
-      <w:hyperlink w:anchor="_Toc224925299" w:history="1">
+      <w:hyperlink w:anchor="_Toc224925608" w:history="1">
         <w:r>
           <w:rPr>
             <w:rStyle w:val="Lienhypertexte"/>
@@ -925,7 +925,7 @@
             <w:noProof/>
             <w:webHidden/>
           </w:rPr>
-          <w:instrText xml:space="preserve"> PAGEREF _Toc224925299 \h </w:instrText>
+          <w:instrText xml:space="preserve"> PAGEREF _Toc224925608 \h </w:instrText>
         </w:r>
         <w:r>
           <w:rPr>
@@ -972,7 +972,7 @@
           <w14:ligatures w14:val="standardContextual"/>
         </w:rPr>
       </w:pPr>
-      <w:hyperlink w:anchor="_Toc224925300" w:history="1">
+      <w:hyperlink w:anchor="_Toc224925609" w:history="1">
         <w:r>
           <w:rPr>
             <w:rStyle w:val="Lienhypertexte"/>
@@ -999,7 +999,7 @@
             <w:noProof/>
             <w:webHidden/>
           </w:rPr>
-          <w:instrText xml:space="preserve"> PAGEREF _Toc224925300 \h </w:instrText>
+          <w:instrText xml:space="preserve"> PAGEREF _Toc224925609 \h </w:instrText>
         </w:r>
         <w:r>
           <w:rPr>
@@ -1046,7 +1046,7 @@
           <w14:ligatures w14:val="standardContextual"/>
         </w:rPr>
       </w:pPr>
-      <w:hyperlink w:anchor="_Toc224925301" w:history="1">
+      <w:hyperlink w:anchor="_Toc224925610" w:history="1">
         <w:r>
           <w:rPr>
             <w:rStyle w:val="Lienhypertexte"/>
@@ -1073,7 +1073,7 @@
             <w:noProof/>
             <w:webHidden/>
           </w:rPr>
-          <w:instrText xml:space="preserve"> PAGEREF _Toc224925301 \h </w:instrText>
+          <w:instrText xml:space="preserve"> PAGEREF _Toc224925610 \h </w:instrText>
         </w:r>
         <w:r>
           <w:rPr>
@@ -1121,7 +1121,7 @@
           <w14:ligatures w14:val="standardContextual"/>
         </w:rPr>
       </w:pPr>
-      <w:hyperlink w:anchor="_Toc224925302" w:history="1">
+      <w:hyperlink w:anchor="_Toc224925611" w:history="1">
         <w:r>
           <w:rPr>
             <w:rStyle w:val="Lienhypertexte"/>
@@ -1148,7 +1148,7 @@
             <w:noProof/>
             <w:webHidden/>
           </w:rPr>
-          <w:instrText xml:space="preserve"> PAGEREF _Toc224925302 \h </w:instrText>
+          <w:instrText xml:space="preserve"> PAGEREF _Toc224925611 \h </w:instrText>
         </w:r>
         <w:r>
           <w:rPr>
@@ -1196,7 +1196,7 @@
           <w14:ligatures w14:val="standardContextual"/>
         </w:rPr>
       </w:pPr>
-      <w:hyperlink w:anchor="_Toc224925303" w:history="1">
+      <w:hyperlink w:anchor="_Toc224925612" w:history="1">
         <w:r>
           <w:rPr>
             <w:rStyle w:val="Lienhypertexte"/>
@@ -1223,7 +1223,7 @@
             <w:noProof/>
             <w:webHidden/>
           </w:rPr>
-          <w:instrText xml:space="preserve"> PAGEREF _Toc224925303 \h </w:instrText>
+          <w:instrText xml:space="preserve"> PAGEREF _Toc224925612 \h </w:instrText>
         </w:r>
         <w:r>
           <w:rPr>
@@ -1271,7 +1271,7 @@
           <w14:ligatures w14:val="standardContextual"/>
         </w:rPr>
       </w:pPr>
-      <w:hyperlink w:anchor="_Toc224925304" w:history="1">
+      <w:hyperlink w:anchor="_Toc224925613" w:history="1">
         <w:r>
           <w:rPr>
             <w:rStyle w:val="Lienhypertexte"/>
@@ -1298,7 +1298,7 @@
             <w:noProof/>
             <w:webHidden/>
           </w:rPr>
-          <w:instrText xml:space="preserve"> PAGEREF _Toc224925304 \h </w:instrText>
+          <w:instrText xml:space="preserve"> PAGEREF _Toc224925613 \h </w:instrText>
         </w:r>
         <w:r>
           <w:rPr>
@@ -1345,7 +1345,7 @@
           <w14:ligatures w14:val="standardContextual"/>
         </w:rPr>
       </w:pPr>
-      <w:hyperlink w:anchor="_Toc224925305" w:history="1">
+      <w:hyperlink w:anchor="_Toc224925614" w:history="1">
         <w:r>
           <w:rPr>
             <w:rStyle w:val="Lienhypertexte"/>
@@ -1372,7 +1372,7 @@
             <w:noProof/>
             <w:webHidden/>
           </w:rPr>
-          <w:instrText xml:space="preserve"> PAGEREF _Toc224925305 \h </w:instrText>
+          <w:instrText xml:space="preserve"> PAGEREF _Toc224925614 \h </w:instrText>
         </w:r>
         <w:r>
           <w:rPr>
@@ -1420,7 +1420,7 @@
           <w14:ligatures w14:val="standardContextual"/>
         </w:rPr>
       </w:pPr>
-      <w:hyperlink w:anchor="_Toc224925306" w:history="1">
+      <w:hyperlink w:anchor="_Toc224925615" w:history="1">
         <w:r>
           <w:rPr>
             <w:rStyle w:val="Lienhypertexte"/>
@@ -1447,7 +1447,7 @@
             <w:noProof/>
             <w:webHidden/>
           </w:rPr>
-          <w:instrText xml:space="preserve"> PAGEREF _Toc224925306 \h </w:instrText>
+          <w:instrText xml:space="preserve"> PAGEREF _Toc224925615 \h </w:instrText>
         </w:r>
         <w:r>
           <w:rPr>
@@ -1495,7 +1495,7 @@
           <w14:ligatures w14:val="standardContextual"/>
         </w:rPr>
       </w:pPr>
-      <w:hyperlink w:anchor="_Toc224925307" w:history="1">
+      <w:hyperlink w:anchor="_Toc224925616" w:history="1">
         <w:r>
           <w:rPr>
             <w:rStyle w:val="Lienhypertexte"/>
@@ -1522,7 +1522,7 @@
             <w:noProof/>
             <w:webHidden/>
           </w:rPr>
-          <w:instrText xml:space="preserve"> PAGEREF _Toc224925307 \h </w:instrText>
+          <w:instrText xml:space="preserve"> PAGEREF _Toc224925616 \h </w:instrText>
         </w:r>
         <w:r>
           <w:rPr>
@@ -1570,7 +1570,7 @@
           <w14:ligatures w14:val="standardContextual"/>
         </w:rPr>
       </w:pPr>
-      <w:hyperlink w:anchor="_Toc224925308" w:history="1">
+      <w:hyperlink w:anchor="_Toc224925617" w:history="1">
         <w:r>
           <w:rPr>
             <w:rStyle w:val="Lienhypertexte"/>
@@ -1597,7 +1597,7 @@
             <w:noProof/>
             <w:webHidden/>
           </w:rPr>
-          <w:instrText xml:space="preserve"> PAGEREF _Toc224925308 \h </w:instrText>
+          <w:instrText xml:space="preserve"> PAGEREF _Toc224925617 \h </w:instrText>
         </w:r>
         <w:r>
           <w:rPr>
@@ -1644,7 +1644,7 @@
           <w14:ligatures w14:val="standardContextual"/>
         </w:rPr>
       </w:pPr>
-      <w:hyperlink w:anchor="_Toc224925309" w:history="1">
+      <w:hyperlink w:anchor="_Toc224925618" w:history="1">
         <w:r>
           <w:rPr>
             <w:rStyle w:val="Lienhypertexte"/>
@@ -1671,7 +1671,7 @@
             <w:noProof/>
             <w:webHidden/>
           </w:rPr>
-          <w:instrText xml:space="preserve"> PAGEREF _Toc224925309 \h </w:instrText>
+          <w:instrText xml:space="preserve"> PAGEREF _Toc224925618 \h </w:instrText>
         </w:r>
         <w:r>
           <w:rPr>
@@ -1719,7 +1719,7 @@
           <w14:ligatures w14:val="standardContextual"/>
         </w:rPr>
       </w:pPr>
-      <w:hyperlink w:anchor="_Toc224925310" w:history="1">
+      <w:hyperlink w:anchor="_Toc224925619" w:history="1">
         <w:r>
           <w:rPr>
             <w:rStyle w:val="Lienhypertexte"/>
@@ -1746,7 +1746,7 @@
             <w:noProof/>
             <w:webHidden/>
           </w:rPr>
-          <w:instrText xml:space="preserve"> PAGEREF _Toc224925310 \h </w:instrText>
+          <w:instrText xml:space="preserve"> PAGEREF _Toc224925619 \h </w:instrText>
         </w:r>
         <w:r>
           <w:rPr>
@@ -1794,7 +1794,7 @@
           <w14:ligatures w14:val="standardContextual"/>
         </w:rPr>
       </w:pPr>
-      <w:hyperlink w:anchor="_Toc224925311" w:history="1">
+      <w:hyperlink w:anchor="_Toc224925620" w:history="1">
         <w:r>
           <w:rPr>
             <w:rStyle w:val="Lienhypertexte"/>
@@ -1821,7 +1821,7 @@
             <w:noProof/>
             <w:webHidden/>
           </w:rPr>
-          <w:instrText xml:space="preserve"> PAGEREF _Toc224925311 \h </w:instrText>
+          <w:instrText xml:space="preserve"> PAGEREF _Toc224925620 \h </w:instrText>
         </w:r>
         <w:r>
           <w:rPr>
@@ -1869,7 +1869,7 @@
           <w14:ligatures w14:val="standardContextual"/>
         </w:rPr>
       </w:pPr>
-      <w:hyperlink w:anchor="_Toc224925312" w:history="1">
+      <w:hyperlink w:anchor="_Toc224925621" w:history="1">
         <w:r>
           <w:rPr>
             <w:rStyle w:val="Lienhypertexte"/>
@@ -1896,7 +1896,7 @@
             <w:noProof/>
             <w:webHidden/>
           </w:rPr>
-          <w:instrText xml:space="preserve"> PAGEREF _Toc224925312 \h </w:instrText>
+          <w:instrText xml:space="preserve"> PAGEREF _Toc224925621 \h </w:instrText>
         </w:r>
         <w:r>
           <w:rPr>
@@ -1944,7 +1944,7 @@
           <w14:ligatures w14:val="standardContextual"/>
         </w:rPr>
       </w:pPr>
-      <w:hyperlink w:anchor="_Toc224925313" w:history="1">
+      <w:hyperlink w:anchor="_Toc224925622" w:history="1">
         <w:r>
           <w:rPr>
             <w:rStyle w:val="Lienhypertexte"/>
@@ -1971,7 +1971,7 @@
             <w:noProof/>
             <w:webHidden/>
           </w:rPr>
-          <w:instrText xml:space="preserve"> PAGEREF _Toc224925313 \h </w:instrText>
+          <w:instrText xml:space="preserve"> PAGEREF _Toc224925622 \h </w:instrText>
         </w:r>
         <w:r>
           <w:rPr>
@@ -2018,7 +2018,7 @@
           <w14:ligatures w14:val="standardContextual"/>
         </w:rPr>
       </w:pPr>
-      <w:hyperlink w:anchor="_Toc224925314" w:history="1">
+      <w:hyperlink w:anchor="_Toc224925623" w:history="1">
         <w:r>
           <w:rPr>
             <w:rStyle w:val="Lienhypertexte"/>
@@ -2045,7 +2045,7 @@
             <w:noProof/>
             <w:webHidden/>
           </w:rPr>
-          <w:instrText xml:space="preserve"> PAGEREF _Toc224925314 \h </w:instrText>
+          <w:instrText xml:space="preserve"> PAGEREF _Toc224925623 \h </w:instrText>
         </w:r>
         <w:r>
           <w:rPr>
@@ -2092,7 +2092,7 @@
           <w14:ligatures w14:val="standardContextual"/>
         </w:rPr>
       </w:pPr>
-      <w:hyperlink w:anchor="_Toc224925315" w:history="1">
+      <w:hyperlink w:anchor="_Toc224925624" w:history="1">
         <w:r>
           <w:rPr>
             <w:rStyle w:val="Lienhypertexte"/>
@@ -2119,7 +2119,7 @@
             <w:noProof/>
             <w:webHidden/>
           </w:rPr>
-          <w:instrText xml:space="preserve"> PAGEREF _Toc224925315 \h </w:instrText>
+          <w:instrText xml:space="preserve"> PAGEREF _Toc224925624 \h </w:instrText>
         </w:r>
         <w:r>
           <w:rPr>
@@ -2166,7 +2166,7 @@
           <w14:ligatures w14:val="standardContextual"/>
         </w:rPr>
       </w:pPr>
-      <w:hyperlink w:anchor="_Toc224925316" w:history="1">
+      <w:hyperlink w:anchor="_Toc224925625" w:history="1">
         <w:r>
           <w:rPr>
             <w:rStyle w:val="Lienhypertexte"/>
@@ -2193,7 +2193,7 @@
             <w:noProof/>
             <w:webHidden/>
           </w:rPr>
-          <w:instrText xml:space="preserve"> PAGEREF _Toc224925316 \h </w:instrText>
+          <w:instrText xml:space="preserve"> PAGEREF _Toc224925625 \h </w:instrText>
         </w:r>
         <w:r>
           <w:rPr>
@@ -2240,7 +2240,7 @@
           <w14:ligatures w14:val="standardContextual"/>
         </w:rPr>
       </w:pPr>
-      <w:hyperlink w:anchor="_Toc224925317" w:history="1">
+      <w:hyperlink w:anchor="_Toc224925626" w:history="1">
         <w:r>
           <w:rPr>
             <w:rStyle w:val="Lienhypertexte"/>
@@ -2267,7 +2267,7 @@
             <w:noProof/>
             <w:webHidden/>
           </w:rPr>
-          <w:instrText xml:space="preserve"> PAGEREF _Toc224925317 \h </w:instrText>
+          <w:instrText xml:space="preserve"> PAGEREF _Toc224925626 \h </w:instrText>
         </w:r>
         <w:r>
           <w:rPr>
@@ -2315,7 +2315,7 @@
           <w14:ligatures w14:val="standardContextual"/>
         </w:rPr>
       </w:pPr>
-      <w:hyperlink w:anchor="_Toc224925318" w:history="1">
+      <w:hyperlink w:anchor="_Toc224925627" w:history="1">
         <w:r>
           <w:rPr>
             <w:rStyle w:val="Lienhypertexte"/>
@@ -2342,7 +2342,7 @@
             <w:noProof/>
             <w:webHidden/>
           </w:rPr>
-          <w:instrText xml:space="preserve"> PAGEREF _Toc224925318 \h </w:instrText>
+          <w:instrText xml:space="preserve"> PAGEREF _Toc224925627 \h </w:instrText>
         </w:r>
         <w:r>
           <w:rPr>
@@ -2390,7 +2390,7 @@
           <w14:ligatures w14:val="standardContextual"/>
         </w:rPr>
       </w:pPr>
-      <w:hyperlink w:anchor="_Toc224925319" w:history="1">
+      <w:hyperlink w:anchor="_Toc224925628" w:history="1">
         <w:r>
           <w:rPr>
             <w:rStyle w:val="Lienhypertexte"/>
@@ -2417,7 +2417,7 @@
             <w:noProof/>
             <w:webHidden/>
           </w:rPr>
-          <w:instrText xml:space="preserve"> PAGEREF _Toc224925319 \h </w:instrText>
+          <w:instrText xml:space="preserve"> PAGEREF _Toc224925628 \h </w:instrText>
         </w:r>
         <w:r>
           <w:rPr>
@@ -2464,7 +2464,7 @@
           <w14:ligatures w14:val="standardContextual"/>
         </w:rPr>
       </w:pPr>
-      <w:hyperlink w:anchor="_Toc224925320" w:history="1">
+      <w:hyperlink w:anchor="_Toc224925629" w:history="1">
         <w:r>
           <w:rPr>
             <w:rStyle w:val="Lienhypertexte"/>
@@ -2491,7 +2491,7 @@
             <w:noProof/>
             <w:webHidden/>
           </w:rPr>
-          <w:instrText xml:space="preserve"> PAGEREF _Toc224925320 \h </w:instrText>
+          <w:instrText xml:space="preserve"> PAGEREF _Toc224925629 \h </w:instrText>
         </w:r>
         <w:r>
           <w:rPr>
@@ -2538,7 +2538,7 @@
           <w14:ligatures w14:val="standardContextual"/>
         </w:rPr>
       </w:pPr>
-      <w:hyperlink w:anchor="_Toc224925321" w:history="1">
+      <w:hyperlink w:anchor="_Toc224925630" w:history="1">
         <w:r>
           <w:rPr>
             <w:rStyle w:val="Lienhypertexte"/>
@@ -2565,7 +2565,7 @@
             <w:noProof/>
             <w:webHidden/>
           </w:rPr>
-          <w:instrText xml:space="preserve"> PAGEREF _Toc224925321 \h </w:instrText>
+          <w:instrText xml:space="preserve"> PAGEREF _Toc224925630 \h </w:instrText>
         </w:r>
         <w:r>
           <w:rPr>
@@ -2612,7 +2612,7 @@
           <w14:ligatures w14:val="standardContextual"/>
         </w:rPr>
       </w:pPr>
-      <w:hyperlink w:anchor="_Toc224925322" w:history="1">
+      <w:hyperlink w:anchor="_Toc224925631" w:history="1">
         <w:r>
           <w:rPr>
             <w:rStyle w:val="Lienhypertexte"/>
@@ -2639,7 +2639,7 @@
             <w:noProof/>
             <w:webHidden/>
           </w:rPr>
-          <w:instrText xml:space="preserve"> PAGEREF _Toc224925322 \h </w:instrText>
+          <w:instrText xml:space="preserve"> PAGEREF _Toc224925631 \h </w:instrText>
         </w:r>
         <w:r>
           <w:rPr>
@@ -2687,7 +2687,7 @@
           <w14:ligatures w14:val="standardContextual"/>
         </w:rPr>
       </w:pPr>
-      <w:hyperlink w:anchor="_Toc224925323" w:history="1">
+      <w:hyperlink w:anchor="_Toc224925632" w:history="1">
         <w:r>
           <w:rPr>
             <w:rStyle w:val="Lienhypertexte"/>
@@ -2714,7 +2714,7 @@
             <w:noProof/>
             <w:webHidden/>
           </w:rPr>
-          <w:instrText xml:space="preserve"> PAGEREF _Toc224925323 \h </w:instrText>
+          <w:instrText xml:space="preserve"> PAGEREF _Toc224925632 \h </w:instrText>
         </w:r>
         <w:r>
           <w:rPr>
@@ -2761,7 +2761,7 @@
           <w14:ligatures w14:val="standardContextual"/>
         </w:rPr>
       </w:pPr>
-      <w:hyperlink w:anchor="_Toc224925324" w:history="1">
+      <w:hyperlink w:anchor="_Toc224925633" w:history="1">
         <w:r>
           <w:rPr>
             <w:rStyle w:val="Lienhypertexte"/>
@@ -2788,7 +2788,7 @@
             <w:noProof/>
             <w:webHidden/>
           </w:rPr>
-          <w:instrText xml:space="preserve"> PAGEREF _Toc224925324 \h </w:instrText>
+          <w:instrText xml:space="preserve"> PAGEREF _Toc224925633 \h </w:instrText>
         </w:r>
         <w:r>
           <w:rPr>
@@ -2835,7 +2835,7 @@
           <w14:ligatures w14:val="standardContextual"/>
         </w:rPr>
       </w:pPr>
-      <w:hyperlink w:anchor="_Toc224925325" w:history="1">
+      <w:hyperlink w:anchor="_Toc224925634" w:history="1">
         <w:r>
           <w:rPr>
             <w:rStyle w:val="Lienhypertexte"/>
@@ -2862,7 +2862,7 @@
             <w:noProof/>
             <w:webHidden/>
           </w:rPr>
-          <w:instrText xml:space="preserve"> PAGEREF _Toc224925325 \h </w:instrText>
+          <w:instrText xml:space="preserve"> PAGEREF _Toc224925634 \h </w:instrText>
         </w:r>
         <w:r>
           <w:rPr>
@@ -2909,7 +2909,7 @@
           <w14:ligatures w14:val="standardContextual"/>
         </w:rPr>
       </w:pPr>
-      <w:hyperlink w:anchor="_Toc224925326" w:history="1">
+      <w:hyperlink w:anchor="_Toc224925635" w:history="1">
         <w:r>
           <w:rPr>
             <w:rStyle w:val="Lienhypertexte"/>
@@ -2936,7 +2936,7 @@
             <w:noProof/>
             <w:webHidden/>
           </w:rPr>
-          <w:instrText xml:space="preserve"> PAGEREF _Toc224925326 \h </w:instrText>
+          <w:instrText xml:space="preserve"> PAGEREF _Toc224925635 \h </w:instrText>
         </w:r>
         <w:r>
           <w:rPr>
@@ -2983,7 +2983,7 @@
           <w14:ligatures w14:val="standardContextual"/>
         </w:rPr>
       </w:pPr>
-      <w:hyperlink w:anchor="_Toc224925327" w:history="1">
+      <w:hyperlink w:anchor="_Toc224925636" w:history="1">
         <w:r>
           <w:rPr>
             <w:rStyle w:val="Lienhypertexte"/>
@@ -3010,7 +3010,7 @@
             <w:noProof/>
             <w:webHidden/>
           </w:rPr>
-          <w:instrText xml:space="preserve"> PAGEREF _Toc224925327 \h </w:instrText>
+          <w:instrText xml:space="preserve"> PAGEREF _Toc224925636 \h </w:instrText>
         </w:r>
         <w:r>
           <w:rPr>
@@ -3057,7 +3057,7 @@
           <w14:ligatures w14:val="standardContextual"/>
         </w:rPr>
       </w:pPr>
-      <w:hyperlink w:anchor="_Toc224925328" w:history="1">
+      <w:hyperlink w:anchor="_Toc224925637" w:history="1">
         <w:r>
           <w:rPr>
             <w:rStyle w:val="Lienhypertexte"/>
@@ -3084,7 +3084,7 @@
             <w:noProof/>
             <w:webHidden/>
           </w:rPr>
-          <w:instrText xml:space="preserve"> PAGEREF _Toc224925328 \h </w:instrText>
+          <w:instrText xml:space="preserve"> PAGEREF _Toc224925637 \h </w:instrText>
         </w:r>
         <w:r>
           <w:rPr>
@@ -3131,7 +3131,7 @@
           <w14:ligatures w14:val="standardContextual"/>
         </w:rPr>
       </w:pPr>
-      <w:hyperlink w:anchor="_Toc224925329" w:history="1">
+      <w:hyperlink w:anchor="_Toc224925638" w:history="1">
         <w:r>
           <w:rPr>
             <w:rStyle w:val="Lienhypertexte"/>
@@ -3158,7 +3158,7 @@
             <w:noProof/>
             <w:webHidden/>
           </w:rPr>
-          <w:instrText xml:space="preserve"> PAGEREF _Toc224925329 \h </w:instrText>
+          <w:instrText xml:space="preserve"> PAGEREF _Toc224925638 \h </w:instrText>
         </w:r>
         <w:r>
           <w:rPr>
@@ -3206,7 +3206,7 @@
           <w14:ligatures w14:val="standardContextual"/>
         </w:rPr>
       </w:pPr>
-      <w:hyperlink w:anchor="_Toc224925330" w:history="1">
+      <w:hyperlink w:anchor="_Toc224925639" w:history="1">
         <w:r>
           <w:rPr>
             <w:rStyle w:val="Lienhypertexte"/>
@@ -3233,7 +3233,7 @@
             <w:noProof/>
             <w:webHidden/>
           </w:rPr>
-          <w:instrText xml:space="preserve"> PAGEREF _Toc224925330 \h </w:instrText>
+          <w:instrText xml:space="preserve"> PAGEREF _Toc224925639 \h </w:instrText>
         </w:r>
         <w:r>
           <w:rPr>
@@ -3280,7 +3280,7 @@
           <w14:ligatures w14:val="standardContextual"/>
         </w:rPr>
       </w:pPr>
-      <w:hyperlink w:anchor="_Toc224925331" w:history="1">
+      <w:hyperlink w:anchor="_Toc224925640" w:history="1">
         <w:r>
           <w:rPr>
             <w:rStyle w:val="Lienhypertexte"/>
@@ -3307,7 +3307,7 @@
             <w:noProof/>
             <w:webHidden/>
           </w:rPr>
-          <w:instrText xml:space="preserve"> PAGEREF _Toc224925331 \h </w:instrText>
+          <w:instrText xml:space="preserve"> PAGEREF _Toc224925640 \h </w:instrText>
         </w:r>
         <w:r>
           <w:rPr>
@@ -3354,7 +3354,7 @@
           <w14:ligatures w14:val="standardContextual"/>
         </w:rPr>
       </w:pPr>
-      <w:hyperlink w:anchor="_Toc224925332" w:history="1">
+      <w:hyperlink w:anchor="_Toc224925641" w:history="1">
         <w:r>
           <w:rPr>
             <w:rStyle w:val="Lienhypertexte"/>
@@ -3381,7 +3381,7 @@
             <w:noProof/>
             <w:webHidden/>
           </w:rPr>
-          <w:instrText xml:space="preserve"> PAGEREF _Toc224925332 \h </w:instrText>
+          <w:instrText xml:space="preserve"> PAGEREF _Toc224925641 \h </w:instrText>
         </w:r>
         <w:r>
           <w:rPr>
@@ -3428,7 +3428,7 @@
           <w14:ligatures w14:val="standardContextual"/>
         </w:rPr>
       </w:pPr>
-      <w:hyperlink w:anchor="_Toc224925333" w:history="1">
+      <w:hyperlink w:anchor="_Toc224925642" w:history="1">
         <w:r>
           <w:rPr>
             <w:rStyle w:val="Lienhypertexte"/>
@@ -3455,7 +3455,7 @@
             <w:noProof/>
             <w:webHidden/>
           </w:rPr>
-          <w:instrText xml:space="preserve"> PAGEREF _Toc224925333 \h </w:instrText>
+          <w:instrText xml:space="preserve"> PAGEREF _Toc224925642 \h </w:instrText>
         </w:r>
         <w:r>
           <w:rPr>
@@ -3502,7 +3502,7 @@
           <w14:ligatures w14:val="standardContextual"/>
         </w:rPr>
       </w:pPr>
-      <w:hyperlink w:anchor="_Toc224925334" w:history="1">
+      <w:hyperlink w:anchor="_Toc224925643" w:history="1">
         <w:r>
           <w:rPr>
             <w:rStyle w:val="Lienhypertexte"/>
@@ -3529,7 +3529,7 @@
             <w:noProof/>
             <w:webHidden/>
           </w:rPr>
-          <w:instrText xml:space="preserve"> PAGEREF _Toc224925334 \h </w:instrText>
+          <w:instrText xml:space="preserve"> PAGEREF _Toc224925643 \h </w:instrText>
         </w:r>
         <w:r>
           <w:rPr>
@@ -3576,7 +3576,7 @@
           <w14:ligatures w14:val="standardContextual"/>
         </w:rPr>
       </w:pPr>
-      <w:hyperlink w:anchor="_Toc224925335" w:history="1">
+      <w:hyperlink w:anchor="_Toc224925644" w:history="1">
         <w:r>
           <w:rPr>
             <w:rStyle w:val="Lienhypertexte"/>
@@ -3603,7 +3603,7 @@
             <w:noProof/>
             <w:webHidden/>
           </w:rPr>
-          <w:instrText xml:space="preserve"> PAGEREF _Toc224925335 \h </w:instrText>
+          <w:instrText xml:space="preserve"> PAGEREF _Toc224925644 \h </w:instrText>
         </w:r>
         <w:r>
           <w:rPr>
@@ -3650,7 +3650,7 @@
           <w14:ligatures w14:val="standardContextual"/>
         </w:rPr>
       </w:pPr>
-      <w:hyperlink w:anchor="_Toc224925336" w:history="1">
+      <w:hyperlink w:anchor="_Toc224925645" w:history="1">
         <w:r>
           <w:rPr>
             <w:rStyle w:val="Lienhypertexte"/>
@@ -3677,7 +3677,7 @@
             <w:noProof/>
             <w:webHidden/>
           </w:rPr>
-          <w:instrText xml:space="preserve"> PAGEREF _Toc224925336 \h </w:instrText>
+          <w:instrText xml:space="preserve"> PAGEREF _Toc224925645 \h </w:instrText>
         </w:r>
         <w:r>
           <w:rPr>
@@ -3724,7 +3724,7 @@
           <w14:ligatures w14:val="standardContextual"/>
         </w:rPr>
       </w:pPr>
-      <w:hyperlink w:anchor="_Toc224925337" w:history="1">
+      <w:hyperlink w:anchor="_Toc224925646" w:history="1">
         <w:r>
           <w:rPr>
             <w:rStyle w:val="Lienhypertexte"/>
@@ -3751,7 +3751,7 @@
             <w:noProof/>
             <w:webHidden/>
           </w:rPr>
-          <w:instrText xml:space="preserve"> PAGEREF _Toc224925337 \h </w:instrText>
+          <w:instrText xml:space="preserve"> PAGEREF _Toc224925646 \h </w:instrText>
         </w:r>
         <w:r>
           <w:rPr>
@@ -3800,7 +3800,7 @@
           <w14:ligatures w14:val="standardContextual"/>
         </w:rPr>
       </w:pPr>
-      <w:hyperlink w:anchor="_Toc224925338" w:history="1">
+      <w:hyperlink w:anchor="_Toc224925647" w:history="1">
         <w:r>
           <w:rPr>
             <w:rStyle w:val="Lienhypertexte"/>
@@ -3828,7 +3828,7 @@
             <w:noProof/>
             <w:webHidden/>
           </w:rPr>
-          <w:instrText xml:space="preserve"> PAGEREF _Toc224925338 \h </w:instrText>
+          <w:instrText xml:space="preserve"> PAGEREF _Toc224925647 \h </w:instrText>
         </w:r>
         <w:r>
           <w:rPr>
@@ -3877,7 +3877,7 @@
           <w14:ligatures w14:val="standardContextual"/>
         </w:rPr>
       </w:pPr>
-      <w:hyperlink w:anchor="_Toc224925339" w:history="1">
+      <w:hyperlink w:anchor="_Toc224925648" w:history="1">
         <w:r>
           <w:rPr>
             <w:rStyle w:val="Lienhypertexte"/>
@@ -3904,7 +3904,7 @@
             <w:noProof/>
             <w:webHidden/>
           </w:rPr>
-          <w:instrText xml:space="preserve"> PAGEREF _Toc224925339 \h </w:instrText>
+          <w:instrText xml:space="preserve"> PAGEREF _Toc224925648 \h </w:instrText>
         </w:r>
         <w:r>
           <w:rPr>
@@ -3944,7 +3944,7 @@
       <w:pPr>
         <w:pStyle w:val="Titre1"/>
       </w:pPr>
-      <w:bookmarkStart w:id="0" w:name="_Toc224925289"/>
+      <w:bookmarkStart w:id="0" w:name="_Toc224925598"/>
       <w:r>
         <w:t>Prolégomènes</w:t>
       </w:r>
@@ -3954,7 +3954,7 @@
       <w:pPr>
         <w:pStyle w:val="Titre2"/>
       </w:pPr>
-      <w:bookmarkStart w:id="1" w:name="_Toc224925290"/>
+      <w:bookmarkStart w:id="1" w:name="_Toc224925599"/>
       <w:r>
         <w:t>Travailler avec un classeur Excel prenant en charge les macros</w:t>
       </w:r>
@@ -4140,7 +4140,7 @@
       <w:pPr>
         <w:pStyle w:val="Titre2"/>
       </w:pPr>
-      <w:bookmarkStart w:id="2" w:name="_Toc224925291"/>
+      <w:bookmarkStart w:id="2" w:name="_Toc224925600"/>
       <w:r>
         <w:lastRenderedPageBreak/>
         <w:t xml:space="preserve">Le </w:t>
@@ -4288,7 +4288,7 @@
       <w:pPr>
         <w:pStyle w:val="Titre2"/>
       </w:pPr>
-      <w:bookmarkStart w:id="3" w:name="_Toc224925292"/>
+      <w:bookmarkStart w:id="3" w:name="_Toc224925601"/>
       <w:r>
         <w:t xml:space="preserve">Code pour les </w:t>
       </w:r>
@@ -4384,7 +4384,7 @@
       <w:pPr>
         <w:pStyle w:val="Titre1"/>
       </w:pPr>
-      <w:bookmarkStart w:id="4" w:name="_Toc224925293"/>
+      <w:bookmarkStart w:id="4" w:name="_Toc224925602"/>
       <w:r>
         <w:t>Liste avec</w:t>
       </w:r>
@@ -4418,7 +4418,7 @@
       <w:pPr>
         <w:pStyle w:val="Titre2"/>
       </w:pPr>
-      <w:bookmarkStart w:id="5" w:name="_Toc224925294"/>
+      <w:bookmarkStart w:id="5" w:name="_Toc224925603"/>
       <w:r>
         <w:t xml:space="preserve">Avec </w:t>
       </w:r>
@@ -4974,7 +4974,7 @@
       <w:pPr>
         <w:pStyle w:val="Titre3"/>
       </w:pPr>
-      <w:bookmarkStart w:id="6" w:name="_Toc224925295"/>
+      <w:bookmarkStart w:id="6" w:name="_Toc224925604"/>
       <w:r>
         <w:t>Syntaxe de la fonction REMPLACER</w:t>
       </w:r>
@@ -5359,7 +5359,7 @@
       <w:pPr>
         <w:pStyle w:val="Titre3"/>
       </w:pPr>
-      <w:bookmarkStart w:id="7" w:name="_Toc224925296"/>
+      <w:bookmarkStart w:id="7" w:name="_Toc224925605"/>
       <w:r>
         <w:t>Syntaxe de la fonction TROUVE</w:t>
       </w:r>
@@ -5728,7 +5728,7 @@
       <w:pPr>
         <w:pStyle w:val="Titre3"/>
       </w:pPr>
-      <w:bookmarkStart w:id="8" w:name="_Toc224925297"/>
+      <w:bookmarkStart w:id="8" w:name="_Toc224925606"/>
       <w:r>
         <w:t>Explications :</w:t>
       </w:r>
@@ -5927,7 +5927,7 @@
       <w:pPr>
         <w:pStyle w:val="Titre3"/>
       </w:pPr>
-      <w:bookmarkStart w:id="9" w:name="_Toc224925298"/>
+      <w:bookmarkStart w:id="9" w:name="_Toc224925607"/>
       <w:r>
         <w:t>Syntaxe</w:t>
       </w:r>
@@ -5991,7 +5991,7 @@
       <w:pPr>
         <w:pStyle w:val="Titre4"/>
       </w:pPr>
-      <w:bookmarkStart w:id="10" w:name="_Toc224925299"/>
+      <w:bookmarkStart w:id="10" w:name="_Toc224925608"/>
       <w:r>
         <w:t>Syntaxe de la fonction INDEX</w:t>
       </w:r>
@@ -6543,7 +6543,7 @@
       <w:pPr>
         <w:pStyle w:val="Titre4"/>
       </w:pPr>
-      <w:bookmarkStart w:id="11" w:name="_Toc224925300"/>
+      <w:bookmarkStart w:id="11" w:name="_Toc224925609"/>
       <w:r>
         <w:t>Syntaxe de la fonction INDEX</w:t>
       </w:r>
@@ -7210,7 +7210,7 @@
       <w:pPr>
         <w:pStyle w:val="Titre2"/>
       </w:pPr>
-      <w:bookmarkStart w:id="12" w:name="_Toc224925301"/>
+      <w:bookmarkStart w:id="12" w:name="_Toc224925610"/>
       <w:r>
         <w:t>Avec LIRE.CLASSEUR , TRANSPOSE et SUBSTITUE</w:t>
       </w:r>
@@ -7836,7 +7836,7 @@
       <w:pPr>
         <w:pStyle w:val="Titre3"/>
       </w:pPr>
-      <w:bookmarkStart w:id="13" w:name="_Toc224925302"/>
+      <w:bookmarkStart w:id="13" w:name="_Toc224925611"/>
       <w:r>
         <w:t>Syntaxe de la fonction SUBSTITUE</w:t>
       </w:r>
@@ -8297,7 +8297,7 @@
       <w:pPr>
         <w:pStyle w:val="Titre3"/>
       </w:pPr>
-      <w:bookmarkStart w:id="14" w:name="_Toc224925303"/>
+      <w:bookmarkStart w:id="14" w:name="_Toc224925612"/>
       <w:r>
         <w:t>Syntaxe de la fonction TRANSPOSE</w:t>
       </w:r>
@@ -8746,7 +8746,7 @@
       <w:pPr>
         <w:pStyle w:val="Titre3"/>
       </w:pPr>
-      <w:bookmarkStart w:id="15" w:name="_Toc224925304"/>
+      <w:bookmarkStart w:id="15" w:name="_Toc224925613"/>
       <w:r>
         <w:t>Explications :</w:t>
       </w:r>
@@ -8986,7 +8986,7 @@
       <w:pPr>
         <w:pStyle w:val="Titre2"/>
       </w:pPr>
-      <w:bookmarkStart w:id="16" w:name="_Toc224925305"/>
+      <w:bookmarkStart w:id="16" w:name="_Toc224925614"/>
       <w:r>
         <w:t>Avec LIRE.CLASSEUR, REMPLACER, TROUVE et TRANSPOSE</w:t>
       </w:r>
@@ -9001,7 +9001,7 @@
       <w:pPr>
         <w:pStyle w:val="Titre3"/>
       </w:pPr>
-      <w:bookmarkStart w:id="17" w:name="_Toc224925306"/>
+      <w:bookmarkStart w:id="17" w:name="_Toc224925615"/>
       <w:r>
         <w:t>Étape 1 : Clique</w:t>
       </w:r>
@@ -9142,7 +9142,7 @@
       <w:pPr>
         <w:pStyle w:val="Titre3"/>
       </w:pPr>
-      <w:bookmarkStart w:id="18" w:name="_Toc224925307"/>
+      <w:bookmarkStart w:id="18" w:name="_Toc224925616"/>
       <w:r>
         <w:t>Étape 2 : Modifiez le nom et la formule dans la boîte de dialogue Nouveau nom</w:t>
       </w:r>
@@ -9573,7 +9573,7 @@
       <w:pPr>
         <w:pStyle w:val="Titre3"/>
       </w:pPr>
-      <w:bookmarkStart w:id="19" w:name="_Toc224925308"/>
+      <w:bookmarkStart w:id="19" w:name="_Toc224925617"/>
       <w:r>
         <w:t>Étape 3 : Utilisation d'une formule pour lister les noms des feuilles</w:t>
       </w:r>
@@ -9727,7 +9727,7 @@
       <w:pPr>
         <w:pStyle w:val="Titre2"/>
       </w:pPr>
-      <w:bookmarkStart w:id="20" w:name="_Toc224925309"/>
+      <w:bookmarkStart w:id="20" w:name="_Toc224925618"/>
       <w:r>
         <w:t xml:space="preserve">Avec LIRE.CLASSEUR, </w:t>
       </w:r>
@@ -9902,7 +9902,7 @@
       <w:pPr>
         <w:pStyle w:val="Titre3"/>
       </w:pPr>
-      <w:bookmarkStart w:id="21" w:name="_Toc224925310"/>
+      <w:bookmarkStart w:id="21" w:name="_Toc224925619"/>
       <w:r>
         <w:t>Étape 1 : Clique</w:t>
       </w:r>
@@ -9991,7 +9991,7 @@
       <w:pPr>
         <w:pStyle w:val="Titre3"/>
       </w:pPr>
-      <w:bookmarkStart w:id="22" w:name="_Toc224925311"/>
+      <w:bookmarkStart w:id="22" w:name="_Toc224925620"/>
       <w:r>
         <w:t xml:space="preserve">Étape </w:t>
       </w:r>
@@ -10107,7 +10107,7 @@
       <w:pPr>
         <w:pStyle w:val="Titre3"/>
       </w:pPr>
-      <w:bookmarkStart w:id="23" w:name="_Toc224925312"/>
+      <w:bookmarkStart w:id="23" w:name="_Toc224925621"/>
       <w:r>
         <w:t xml:space="preserve">Étape </w:t>
       </w:r>
@@ -10395,7 +10395,7 @@
       <w:pPr>
         <w:pStyle w:val="Titre3"/>
       </w:pPr>
-      <w:bookmarkStart w:id="24" w:name="_Toc224925313"/>
+      <w:bookmarkStart w:id="24" w:name="_Toc224925622"/>
       <w:r>
         <w:t xml:space="preserve">Étape </w:t>
       </w:r>
@@ -10514,7 +10514,7 @@
       <w:pPr>
         <w:pStyle w:val="Titre4"/>
       </w:pPr>
-      <w:bookmarkStart w:id="25" w:name="_Toc224925314"/>
+      <w:bookmarkStart w:id="25" w:name="_Toc224925623"/>
       <w:r>
         <w:t>Syntaxe de</w:t>
       </w:r>
@@ -10951,7 +10951,7 @@
       <w:pPr>
         <w:pStyle w:val="Titre4"/>
       </w:pPr>
-      <w:bookmarkStart w:id="26" w:name="_Toc224925315"/>
+      <w:bookmarkStart w:id="26" w:name="_Toc224925624"/>
       <w:r>
         <w:t>Explications</w:t>
       </w:r>
@@ -10961,7 +10961,7 @@
       <w:pPr>
         <w:pStyle w:val="Titre4"/>
       </w:pPr>
-      <w:bookmarkStart w:id="27" w:name="_Toc224925316"/>
+      <w:bookmarkStart w:id="27" w:name="_Toc224925625"/>
       <w:r>
         <w:t>Décomposer le résultat de LIRE.CLASSEUR()</w:t>
       </w:r>
@@ -11795,7 +11795,7 @@
       <w:pPr>
         <w:pStyle w:val="Titre4"/>
       </w:pPr>
-      <w:bookmarkStart w:id="28" w:name="_Toc224925317"/>
+      <w:bookmarkStart w:id="28" w:name="_Toc224925626"/>
       <w:r>
         <w:t>Autre solution avec la fonction DROITE()</w:t>
       </w:r>
@@ -12074,7 +12074,7 @@
       <w:pPr>
         <w:pStyle w:val="Titre3"/>
       </w:pPr>
-      <w:bookmarkStart w:id="29" w:name="_Toc224925318"/>
+      <w:bookmarkStart w:id="29" w:name="_Toc224925627"/>
       <w:r>
         <w:t xml:space="preserve">Étape </w:t>
       </w:r>
@@ -12566,7 +12566,7 @@
       <w:pPr>
         <w:pStyle w:val="Titre3"/>
       </w:pPr>
-      <w:bookmarkStart w:id="30" w:name="_Toc224925319"/>
+      <w:bookmarkStart w:id="30" w:name="_Toc224925628"/>
       <w:r>
         <w:lastRenderedPageBreak/>
         <w:t>Étape 6 : Gérer les erreurs #REF ! avec la fonction SIERREUR</w:t>
@@ -12649,7 +12649,7 @@
       <w:pPr>
         <w:pStyle w:val="Titre4"/>
       </w:pPr>
-      <w:bookmarkStart w:id="31" w:name="_Toc224925320"/>
+      <w:bookmarkStart w:id="31" w:name="_Toc224925629"/>
       <w:r>
         <w:t>Syntaxe de la fonction SIERREUR</w:t>
       </w:r>
@@ -13253,7 +13253,7 @@
       <w:pPr>
         <w:pStyle w:val="Titre4"/>
       </w:pPr>
-      <w:bookmarkStart w:id="32" w:name="_Toc224925321"/>
+      <w:bookmarkStart w:id="32" w:name="_Toc224925630"/>
       <w:r>
         <w:t>Modification de la formule pour ne pas compter la feuille Sommaire</w:t>
       </w:r>
@@ -13423,7 +13423,7 @@
       <w:pPr>
         <w:pStyle w:val="Titre2"/>
       </w:pPr>
-      <w:bookmarkStart w:id="33" w:name="_Toc224925322"/>
+      <w:bookmarkStart w:id="33" w:name="_Toc224925631"/>
       <w:r>
         <w:t>Pour aller plus loin</w:t>
       </w:r>
@@ -13433,7 +13433,7 @@
       <w:pPr>
         <w:pStyle w:val="Titre3"/>
       </w:pPr>
-      <w:bookmarkStart w:id="34" w:name="_Toc224925323"/>
+      <w:bookmarkStart w:id="34" w:name="_Toc224925632"/>
       <w:r>
         <w:t>Rendre l'affichage</w:t>
       </w:r>
@@ -13613,7 +13613,7 @@
       <w:pPr>
         <w:pStyle w:val="Titre4"/>
       </w:pPr>
-      <w:bookmarkStart w:id="35" w:name="_Toc224925324"/>
+      <w:bookmarkStart w:id="35" w:name="_Toc224925633"/>
       <w:r>
         <w:t>Avec ALEA et TEXTE</w:t>
       </w:r>
@@ -13649,7 +13649,7 @@
       <w:pPr>
         <w:pStyle w:val="Titre5"/>
       </w:pPr>
-      <w:bookmarkStart w:id="36" w:name="_Toc224925325"/>
+      <w:bookmarkStart w:id="36" w:name="_Toc224925634"/>
       <w:r>
         <w:t xml:space="preserve">Syntaxe de la fonction </w:t>
       </w:r>
@@ -13821,7 +13821,7 @@
       <w:pPr>
         <w:pStyle w:val="Titre5"/>
       </w:pPr>
-      <w:bookmarkStart w:id="37" w:name="_Toc224925326"/>
+      <w:bookmarkStart w:id="37" w:name="_Toc224925635"/>
       <w:r>
         <w:t>Syntaxe de la fonction TEXTE</w:t>
       </w:r>
@@ -14515,7 +14515,7 @@
       <w:pPr>
         <w:pStyle w:val="Titre4"/>
       </w:pPr>
-      <w:bookmarkStart w:id="38" w:name="_Toc224925327"/>
+      <w:bookmarkStart w:id="38" w:name="_Toc224925636"/>
       <w:r>
         <w:t>Avec</w:t>
       </w:r>
@@ -14536,7 +14536,7 @@
       <w:pPr>
         <w:pStyle w:val="Titre5"/>
       </w:pPr>
-      <w:bookmarkStart w:id="39" w:name="_Toc224925328"/>
+      <w:bookmarkStart w:id="39" w:name="_Toc224925637"/>
       <w:r>
         <w:t xml:space="preserve">Syntaxe de la fonction </w:t>
       </w:r>
@@ -14855,7 +14855,7 @@
       <w:pPr>
         <w:pStyle w:val="Titre5"/>
       </w:pPr>
-      <w:bookmarkStart w:id="40" w:name="_Toc224925329"/>
+      <w:bookmarkStart w:id="40" w:name="_Toc224925638"/>
       <w:r>
         <w:t>Syntaxe de la fonction T</w:t>
       </w:r>
@@ -15406,7 +15406,7 @@
       <w:pPr>
         <w:pStyle w:val="Titre3"/>
       </w:pPr>
-      <w:bookmarkStart w:id="41" w:name="_Toc224925330"/>
+      <w:bookmarkStart w:id="41" w:name="_Toc224925639"/>
       <w:r>
         <w:t>On peut ajouter des liens hypertexte sur le nom des feuilles.</w:t>
       </w:r>
@@ -15421,7 +15421,7 @@
       <w:pPr>
         <w:pStyle w:val="Titre4"/>
       </w:pPr>
-      <w:bookmarkStart w:id="42" w:name="_Toc224925331"/>
+      <w:bookmarkStart w:id="42" w:name="_Toc224925640"/>
       <w:r>
         <w:t>Ajouter des liens hypertexte manuellement</w:t>
       </w:r>
@@ -15472,7 +15472,7 @@
       <w:pPr>
         <w:pStyle w:val="Titre5"/>
       </w:pPr>
-      <w:bookmarkStart w:id="43" w:name="_Toc224925332"/>
+      <w:bookmarkStart w:id="43" w:name="_Toc224925641"/>
       <w:r>
         <w:lastRenderedPageBreak/>
         <w:t>Insérer des liens hypertextes sur les noms figurant dans le sommaire</w:t>
@@ -15970,7 +15970,7 @@
       <w:pPr>
         <w:pStyle w:val="Titre5"/>
       </w:pPr>
-      <w:bookmarkStart w:id="44" w:name="_Toc224925333"/>
+      <w:bookmarkStart w:id="44" w:name="_Toc224925642"/>
       <w:r>
         <w:t xml:space="preserve">Insérer une icône et </w:t>
       </w:r>
@@ -16862,7 +16862,7 @@
       <w:pPr>
         <w:pStyle w:val="Titre4"/>
       </w:pPr>
-      <w:bookmarkStart w:id="45" w:name="_Toc224925334"/>
+      <w:bookmarkStart w:id="45" w:name="_Toc224925643"/>
       <w:r>
         <w:t>Transition vers le VBA : ajouter des liens hypertexte par code</w:t>
       </w:r>
@@ -16908,7 +16908,7 @@
       <w:pPr>
         <w:pStyle w:val="Titre5"/>
       </w:pPr>
-      <w:bookmarkStart w:id="46" w:name="_Toc224925335"/>
+      <w:bookmarkStart w:id="46" w:name="_Toc224925644"/>
       <w:r>
         <w:t>Syntaxe VBA pour un hyperlien</w:t>
       </w:r>
@@ -17618,7 +17618,7 @@
       <w:pPr>
         <w:pStyle w:val="Titre5"/>
       </w:pPr>
-      <w:bookmarkStart w:id="47" w:name="_Toc224925336"/>
+      <w:bookmarkStart w:id="47" w:name="_Toc224925645"/>
       <w:r>
         <w:t>Ajouter un index hyperlien des feuilles dans le classeur</w:t>
       </w:r>
@@ -19907,7 +19907,7 @@
       <w:pPr>
         <w:pStyle w:val="Titre5"/>
       </w:pPr>
-      <w:bookmarkStart w:id="48" w:name="_Toc224925337"/>
+      <w:bookmarkStart w:id="48" w:name="_Toc224925646"/>
       <w:r>
         <w:t>Le principe DRY</w:t>
       </w:r>
@@ -20150,7 +20150,7 @@
           <w:highlight w:val="yellow"/>
         </w:rPr>
       </w:pPr>
-      <w:bookmarkStart w:id="49" w:name="_Toc224925338"/>
+      <w:bookmarkStart w:id="49" w:name="_Toc224925647"/>
       <w:r>
         <w:rPr>
           <w:b/>
@@ -20186,8 +20186,8 @@
       </w:tblPr>
       <w:tblGrid>
         <w:gridCol w:w="1462"/>
-        <w:gridCol w:w="919"/>
-        <w:gridCol w:w="3762"/>
+        <w:gridCol w:w="1002"/>
+        <w:gridCol w:w="4962"/>
       </w:tblGrid>
       <w:tr>
         <w:tc>
@@ -20389,13 +20389,21 @@
           <w:tcPr>
             <w:tcW w:w="0" w:type="auto"/>
           </w:tcPr>
-          <w:p/>
+          <w:p>
+            <w:r>
+              <w:t>NOW</w:t>
+            </w:r>
+          </w:p>
         </w:tc>
         <w:tc>
           <w:tcPr>
             <w:tcW w:w="0" w:type="auto"/>
           </w:tcPr>
-          <w:p/>
+          <w:p>
+            <w:r>
+              <w:t>NOW()</w:t>
+            </w:r>
+          </w:p>
         </w:tc>
       </w:tr>
       <w:tr>
@@ -20413,13 +20421,85 @@
           <w:tcPr>
             <w:tcW w:w="0" w:type="auto"/>
           </w:tcPr>
-          <w:p/>
+          <w:p>
+            <w:r>
+              <w:t>REPLACE</w:t>
+            </w:r>
+          </w:p>
         </w:tc>
         <w:tc>
           <w:tcPr>
             <w:tcW w:w="0" w:type="auto"/>
           </w:tcPr>
-          <w:p/>
+          <w:p>
+            <w:pPr>
+              <w:rPr>
+                <w:lang w:val="en-US"/>
+              </w:rPr>
+            </w:pPr>
+            <w:r>
+              <w:rPr>
+                <w:lang w:val="en-US"/>
+              </w:rPr>
+              <w:t>REPLACE(</w:t>
+            </w:r>
+            <w:proofErr w:type="spellStart"/>
+            <w:r>
+              <w:rPr>
+                <w:lang w:val="en-US"/>
+              </w:rPr>
+              <w:t>old_text</w:t>
+            </w:r>
+            <w:proofErr w:type="spellEnd"/>
+            <w:r>
+              <w:rPr>
+                <w:lang w:val="en-US"/>
+              </w:rPr>
+              <w:t xml:space="preserve">, </w:t>
+            </w:r>
+            <w:proofErr w:type="spellStart"/>
+            <w:r>
+              <w:rPr>
+                <w:lang w:val="en-US"/>
+              </w:rPr>
+              <w:t>start_num</w:t>
+            </w:r>
+            <w:proofErr w:type="spellEnd"/>
+            <w:r>
+              <w:rPr>
+                <w:lang w:val="en-US"/>
+              </w:rPr>
+              <w:t xml:space="preserve">, </w:t>
+            </w:r>
+            <w:proofErr w:type="spellStart"/>
+            <w:r>
+              <w:rPr>
+                <w:lang w:val="en-US"/>
+              </w:rPr>
+              <w:t>num_chars</w:t>
+            </w:r>
+            <w:proofErr w:type="spellEnd"/>
+            <w:r>
+              <w:rPr>
+                <w:lang w:val="en-US"/>
+              </w:rPr>
+              <w:t xml:space="preserve">, </w:t>
+            </w:r>
+            <w:proofErr w:type="spellStart"/>
+            <w:r>
+              <w:rPr>
+                <w:lang w:val="en-US"/>
+              </w:rPr>
+              <w:t>new_text</w:t>
+            </w:r>
+            <w:proofErr w:type="spellEnd"/>
+            <w:r>
+              <w:rPr>
+                <w:lang w:val="en-US"/>
+              </w:rPr>
+              <w:t>)</w:t>
+            </w:r>
+          </w:p>
         </w:tc>
       </w:tr>
       <w:tr>
@@ -20577,7 +20657,7 @@
         <w:pStyle w:val="Titre1"/>
       </w:pPr>
       <w:bookmarkStart w:id="50" w:name="_Toc223707034"/>
-      <w:bookmarkStart w:id="51" w:name="_Toc224925339"/>
+      <w:bookmarkStart w:id="51" w:name="_Toc224925648"/>
       <w:r>
         <w:t>Links</w:t>
       </w:r>
@@ -21570,7 +21650,7 @@
               <w:sz w:val="16"/>
               <w:szCs w:val="16"/>
             </w:rPr>
-            <w:t>20-03-2026 18:49</w:t>
+            <w:t>20-03-2026 18:54</w:t>
           </w:r>
           <w:r>
             <w:rPr>

</xml_diff>